<commit_message>
fix: remove ⚡KI: review markers from templates
These emoji markers cause Word to flag 'unreadable content' on some versions.
The markers were for review purposes and are no longer needed.

Co-Authored-By: Claude Opus 4.6 (1M context) <noreply@anthropic.com>
</commit_message>
<xml_diff>
--- a/gutachtenvorlagen/Gutachten Muster juristische Person.docx
+++ b/gutachtenvorlagen/Gutachten Muster juristische Person.docx
@@ -80,7 +80,7 @@
           <w:b/>
           <w:highlight w:val="yellow"/>
         </w:rPr>
-        <w:t xml:space="preserve">⚡KI: KI_Akte_Bezeichnung </w:t>
+        <w:t xml:space="preserve">KI_Akte_Bezeichnung </w:t>
       </w:r>
       <w:bookmarkEnd w:id="2"/>
       <w:proofErr w:type="spellEnd"/>
@@ -6846,7 +6846,7 @@
         <w:ind w:left="709"/>
       </w:pPr>
       <w:r>
-        <w:t>⚡KI: Dieses Gutachten basiert auf der Auswertung der Gerichtsakten, Gesprächen mit den unten genannten Auskunftspersonen, Inaugenscheinnahmen, den Ergebnissen der beauftragten Sachverständigen und den von KI_Schuldner_der_die KI_Schuldner_Schuldnerin vorgelegten Unterlagen.</w:t>
+        <w:t>Dieses Gutachten basiert auf der Auswertung der Gerichtsakten, Gesprächen mit den unten genannten Auskunftspersonen, Inaugenscheinnahmen, den Ergebnissen der beauftragten Sachverständigen und den von KI_Schuldner_der_die KI_Schuldner_Schuldnerin vorgelegten Unterlagen.</w:t>
       </w:r>
       <w:r/>
     </w:p>
@@ -7279,7 +7279,7 @@
         <w:rPr>
           <w:highlight w:val="yellow"/>
         </w:rPr>
-        <w:t>⚡KI: Danach ist der gerichtlich bestellte Insolvenzverwalter oder Sachwalter in seiner Funktion im Rahmen des Insolvenzverfahrens der unabhängige, objektive, zur Sachlichkeit verpflichtete geschäftskundige Wahrer der Interessen aller im Insolvenzverfahren Beteiligten. Die erforderliche Unabhängigkeit des Unterzeichners und der geforderte Qualitätsstandard sind durch die Zertifizierung nach ISO 9001:2015 und GOI (Grundsätze ordnungsgemäßer Insolvenzverwaltung nach VID) gegeben. Die Zertifizierung wurde zuletzt am 15.07.2025 erneuert.</w:t>
+        <w:t>Danach ist der gerichtlich bestellte Insolvenzverwalter oder Sachwalter in seiner Funktion im Rahmen des Insolvenzverfahrens der unabhängige, objektive, zur Sachlichkeit verpflichtete geschäftskundige Wahrer der Interessen aller im Insolvenzverfahren Beteiligten. Die erforderliche Unabhängigkeit des Unterzeichners und der geforderte Qualitätsstandard sind durch die Zertifizierung nach ISO 9001:2015 und GOI (Grundsätze ordnungsgemäßer Insolvenzverwaltung nach VID) gegeben. Die Zertifizierung wurde zuletzt am 15.07.2025 erneuert.</w:t>
       </w:r>
       <w:r>
         <w:rPr>
@@ -7657,7 +7657,7 @@
                 <w:iCs/>
                 <w:highlight w:val="yellow"/>
               </w:rPr>
-              <w:t>⚡KI: [[SLOT_189: z.B. GmbH, AG, UG]]</w:t>
+              <w:t>[[SLOT_189: z.B. GmbH, AG, UG]]</w:t>
             </w:r>
           </w:p>
         </w:tc>
@@ -8184,7 +8184,7 @@
                 <w:rFonts w:cs="Arial"/>
                 <w:highlight w:val="yellow"/>
               </w:rPr>
-              <w:t>⚡KI: [[SLOT_190: Branche]] https://de.statista.com/statistik/kategorien/</w:t>
+              <w:t>[[SLOT_190: Branche]] https://de.statista.com/statistik/kategorien/</w:t>
             </w:r>
             <w:bookmarkEnd w:id="65"/>
             <w:r>
@@ -8714,7 +8714,7 @@
               <w:rPr>
                 <w:bCs/>
               </w:rPr>
-              <w:t>⚡KI: [[SLOT_191: Ja/Nein]]</w:t>
+              <w:t>[[SLOT_191: Ja/Nein]]</w:t>
             </w:r>
           </w:p>
         </w:tc>
@@ -8762,7 +8762,7 @@
               <w:rPr>
                 <w:bCs/>
               </w:rPr>
-              <w:t>⚡KI: [[SLOT_192: Ja/Nein]]</w:t>
+              <w:t>[[SLOT_192: Ja/Nein]]</w:t>
             </w:r>
           </w:p>
         </w:tc>
@@ -9805,7 +9805,7 @@
               <w:rPr>
                 <w:bCs/>
               </w:rPr>
-              <w:t>⚡KI: [[SLOT_193: ja/nein]]</w:t>
+              <w:t>[[SLOT_193: ja/nein]]</w:t>
             </w:r>
           </w:p>
         </w:tc>
@@ -10317,7 +10317,7 @@
         <w:rPr>
           <w:szCs w:val="22"/>
         </w:rPr>
-        <w:t>⚡KI: Örtliche Zuständigkeit des Amtsgerichts KI_Gericht_Ort, gem. § 3 Abs. 1 InsO</w:t>
+        <w:t>Örtliche Zuständigkeit des Amtsgerichts KI_Gericht_Ort, gem. § 3 Abs. 1 InsO</w:t>
       </w:r>
       <w:r>
         <w:rPr>
@@ -10344,7 +10344,7 @@
         <w:ind w:left="709"/>
       </w:pPr>
       <w:r>
-        <w:t>⚡KI: Die Bestimmung der örtlichen Zuständigkeit richtet sich gem. § 3 Abs. 1 S. 2 InsO in erster Linie nach dem Mittelpunkt der selbstständigen wirtschaftlichen Tätigkeit des Schuldners. Nur wenn keine selbstständige wirtschaftliche Tätigkeit mehr ausgeübt wird, ist gemäß § 3 Abs. 1 S. 1 InsO auf den allgemeinen Gerichtsstand des Schuldners abzustellen. Der Mittelpunkt der selbstständigen Tätigkeit liegt dort, wo unmittelbar Geschäfte abgeschlossen werden. Abzustellen ist auf den Ort der tatsächlichen Willensbildung, das heißt von wo aus die unternehmerischen Leitentscheidungen getroffen und in laufende Geschäftsführungsakte umgesetzt werden (OLG Brandenburg, ZInsO 2002, 767; AG Essen, ZInsO 2009, 2207).</w:t>
+        <w:t>Die Bestimmung der örtlichen Zuständigkeit richtet sich gem. § 3 Abs. 1 S. 2 InsO in erster Linie nach dem Mittelpunkt der selbstständigen wirtschaftlichen Tätigkeit des Schuldners. Nur wenn keine selbstständige wirtschaftliche Tätigkeit mehr ausgeübt wird, ist gemäß § 3 Abs. 1 S. 1 InsO auf den allgemeinen Gerichtsstand des Schuldners abzustellen. Der Mittelpunkt der selbstständigen Tätigkeit liegt dort, wo unmittelbar Geschäfte abgeschlossen werden. Abzustellen ist auf den Ort der tatsächlichen Willensbildung, das heißt von wo aus die unternehmerischen Leitentscheidungen getroffen und in laufende Geschäftsführungsakte umgesetzt werden (OLG Brandenburg, ZInsO 2002, 767; AG Essen, ZInsO 2009, 2207).</w:t>
       </w:r>
       <w:r/>
       <w:r/>
@@ -10507,7 +10507,7 @@
         <w:rPr>
           <w:highlight w:val="yellow"/>
         </w:rPr>
-        <w:t>⚡KI: [[SLOT_105: vorl. Gläubigerausschuss?]]</w:t>
+        <w:t>[[SLOT_105: vorl. Gläubigerausschuss?]]</w:t>
       </w:r>
     </w:p>
     <w:p/>
@@ -10811,7 +10811,7 @@
         <w:rPr>
           <w:szCs w:val="22"/>
         </w:rPr>
-        <w:t>⚡KI: Arbeitsrechtliche Verhältnisse</w:t>
+        <w:t>Arbeitsrechtliche Verhältnisse</w:t>
       </w:r>
       <w:r>
         <w:rPr>
@@ -11002,7 +11002,7 @@
         <w:rPr>
           <w:highlight w:val="yellow"/>
         </w:rPr>
-        <w:t>⚡KI: [[SLOT_112: kollektivarbeitsrechtliche und betriebsverfassungsrechtliche]]</w:t>
+        <w:t>[[SLOT_112: kollektivarbeitsrechtliche und betriebsverfassungsrechtliche]]</w:t>
       </w:r>
     </w:p>
     <w:p>
@@ -11019,7 +11019,7 @@
         <w:rPr>
           <w:highlight w:val="yellow"/>
         </w:rPr>
-        <w:t>⚡KI: [[SLOT_113: außerdem: Geschäftsführeranstellungsvertrag; Achtung: kein A]]</w:t>
+        <w:t>[[SLOT_113: außerdem: Geschäftsführeranstellungsvertrag; Achtung: kein A]]</w:t>
       </w:r>
     </w:p>
     <w:bookmarkEnd w:id="138"/>
@@ -11302,7 +11302,7 @@
         <w:rPr>
           <w:szCs w:val="22"/>
         </w:rPr>
-        <w:t>⚡KI: Arbeitsrechtliche Verhältnisse</w:t>
+        <w:t>Arbeitsrechtliche Verhältnisse</w:t>
       </w:r>
       <w:r>
         <w:rPr>
@@ -11443,7 +11443,7 @@
         <w:rPr>
           <w:highlight w:val="yellow"/>
         </w:rPr>
-        <w:t>⚡KI: [[SLOT_121: kollektivarbeitsrechtliche und betriebsverfassungsrechtliche]]</w:t>
+        <w:t>[[SLOT_121: kollektivarbeitsrechtliche und betriebsverfassungsrechtliche]]</w:t>
       </w:r>
       <w:r>
         <w:rPr>
@@ -11470,7 +11470,7 @@
         <w:rPr>
           <w:highlight w:val="yellow"/>
         </w:rPr>
-        <w:t>⚡KI: [[SLOT_122: außerdem: Geschäftsführeranstellungsvertrag; Achtung: kein A]]</w:t>
+        <w:t>[[SLOT_122: außerdem: Geschäftsführeranstellungsvertrag; Achtung: kein A]]</w:t>
       </w:r>
     </w:p>
     <w:bookmarkEnd w:id="159"/>
@@ -11626,7 +11626,7 @@
                 <w:highlight w:val="yellow"/>
                 <w:u w:val="single"/>
               </w:rPr>
-              <w:t>⚡KI: [[SLOT_194: Kreditinstitut 1]]</w:t>
+              <w:t>[[SLOT_194: Kreditinstitut 1]]</w:t>
             </w:r>
           </w:p>
           <w:p>
@@ -11685,7 +11685,7 @@
               <w:rPr>
                 <w:highlight w:val="yellow"/>
               </w:rPr>
-              <w:t>⚡KI: [[SLOT_195: Tabellenwert]] EUR</w:t>
+              <w:t>[[SLOT_195: Tabellenwert]] EUR</w:t>
             </w:r>
             <w:r/>
             <w:r/>
@@ -11703,7 +11703,7 @@
               <w:rPr>
                 <w:highlight w:val="yellow"/>
               </w:rPr>
-              <w:t>⚡KI: [[SLOT_197: Tabellenwert]] EUR</w:t>
+              <w:t>[[SLOT_197: Tabellenwert]] EUR</w:t>
             </w:r>
             <w:r/>
             <w:r/>
@@ -11763,7 +11763,7 @@
                 <w:highlight w:val="yellow"/>
                 <w:u w:val="single"/>
               </w:rPr>
-              <w:t>⚡KI: [[SLOT_199: Kreditinstitut 2]]</w:t>
+              <w:t>[[SLOT_199: Kreditinstitut 2]]</w:t>
             </w:r>
           </w:p>
           <w:p>
@@ -11823,7 +11823,7 @@
               <w:rPr>
                 <w:highlight w:val="yellow"/>
               </w:rPr>
-              <w:t>⚡KI: [[SLOT_200: Tabellenwert]] EUR</w:t>
+              <w:t>[[SLOT_200: Tabellenwert]] EUR</w:t>
             </w:r>
             <w:r/>
             <w:r/>
@@ -11841,7 +11841,7 @@
               <w:rPr>
                 <w:highlight w:val="yellow"/>
               </w:rPr>
-              <w:t>⚡KI: [[SLOT_202: Tabellenwert]] EUR</w:t>
+              <w:t>[[SLOT_202: Tabellenwert]] EUR</w:t>
             </w:r>
             <w:r/>
             <w:r/>
@@ -11897,7 +11897,7 @@
               <w:rPr>
                 <w:highlight w:val="yellow"/>
               </w:rPr>
-              <w:t>⚡KI: [[SLOT_204: Tabellenwert]]</w:t>
+              <w:t>[[SLOT_204: Tabellenwert]]</w:t>
             </w:r>
           </w:p>
         </w:tc>
@@ -11918,7 +11918,7 @@
               <w:rPr>
                 <w:highlight w:val="yellow"/>
               </w:rPr>
-              <w:t>⚡KI: [[SLOT_206: Tabellenwert]] EUR</w:t>
+              <w:t>[[SLOT_206: Tabellenwert]] EUR</w:t>
             </w:r>
             <w:r/>
             <w:r/>
@@ -11973,7 +11973,7 @@
               <w:rPr>
                 <w:highlight w:val="yellow"/>
               </w:rPr>
-              <w:t>⚡KI: [[SLOT_208: Tabellenwert]]</w:t>
+              <w:t>[[SLOT_208: Tabellenwert]]</w:t>
             </w:r>
           </w:p>
         </w:tc>
@@ -11994,7 +11994,7 @@
               <w:rPr>
                 <w:highlight w:val="yellow"/>
               </w:rPr>
-              <w:t>⚡KI: [[SLOT_210: Tabellenwert]] EUR</w:t>
+              <w:t>[[SLOT_210: Tabellenwert]] EUR</w:t>
             </w:r>
             <w:r/>
             <w:r/>
@@ -12049,7 +12049,7 @@
               <w:rPr>
                 <w:highlight w:val="yellow"/>
               </w:rPr>
-              <w:t>⚡KI: [[SLOT_212: Tabellenwert]]</w:t>
+              <w:t>[[SLOT_212: Tabellenwert]]</w:t>
             </w:r>
           </w:p>
         </w:tc>
@@ -12070,7 +12070,7 @@
               <w:rPr>
                 <w:highlight w:val="yellow"/>
               </w:rPr>
-              <w:t>⚡KI: [[SLOT_214: Tabellenwert]] EUR</w:t>
+              <w:t>[[SLOT_214: Tabellenwert]] EUR</w:t>
             </w:r>
             <w:r/>
             <w:r/>
@@ -13025,7 +13025,7 @@
         <w:rPr>
           <w:highlight w:val="yellow"/>
         </w:rPr>
-        <w:t>⚡KI: KI_Verwalter_Der_Die_Groß KI_Verwalter_Unterzeichner setzt bei der Bewertung des beweglichen Sachanlagevermögens Liquidations- und Fortführungswerte an.</w:t>
+        <w:t>KI_Verwalter_Der_Die_Groß KI_Verwalter_Unterzeichner setzt bei der Bewertung des beweglichen Sachanlagevermögens Liquidations- und Fortführungswerte an.</w:t>
       </w:r>
       <w:bookmarkEnd w:id="199"/>
     </w:p>
@@ -13323,7 +13323,7 @@
         <w:rPr>
           <w:highlight w:val="yellow"/>
         </w:rPr>
-        <w:t>⚡KI: [[SLOT_139: Das Unternehmen hat einen handelsrechtlich nicht bilanzierba]]</w:t>
+        <w:t>[[SLOT_139: Das Unternehmen hat einen handelsrechtlich nicht bilanzierba]]</w:t>
       </w:r>
     </w:p>
     <w:p/>
@@ -13954,7 +13954,7 @@
         <w:rPr>
           <w:highlight w:val="yellow"/>
         </w:rPr>
-        <w:t>⚡KI: [[SLOT_155: Forderungen Beteiligungsunternehmen]]</w:t>
+        <w:t>[[SLOT_155: Forderungen Beteiligungsunternehmen]]</w:t>
       </w:r>
     </w:p>
     <w:p>
@@ -13991,7 +13991,7 @@
         <w:rPr>
           <w:highlight w:val="yellow"/>
         </w:rPr>
-        <w:t>⚡KI: [[SLOT_156: sonstige Vermögensgegenstände Beschreibung/Wert]]</w:t>
+        <w:t>[[SLOT_156: sonstige Vermögensgegenstände Beschreibung/Wert]]</w:t>
       </w:r>
     </w:p>
     <w:bookmarkEnd w:id="220"/>
@@ -14198,7 +14198,7 @@
         <w:rPr>
           <w:rFonts w:cs="Arial"/>
         </w:rPr>
-        <w:t>⚡KI: Bei der [[SLOT_161: xy Bank]] wurde ein Festgeldkonto/Anderkonto/Rückstellungskonto mit der IBAN: xy eingerichtet. Das dortige Guthaben beläuft sich derzeit auf xx EUR.</w:t>
+        <w:t>Bei der [[SLOT_161: xy Bank]] wurde ein Festgeldkonto/Anderkonto/Rückstellungskonto mit der IBAN: xy eingerichtet. Das dortige Guthaben beläuft sich derzeit auf xx EUR.</w:t>
       </w:r>
       <w:r>
         <w:rPr>
@@ -14287,7 +14287,7 @@
         </w:numPr>
       </w:pPr>
       <w:r>
-        <w:t>⚡KI: Ansprüche auf Einzahlung der Stammeinlagen</w:t>
+        <w:t>Ansprüche auf Einzahlung der Stammeinlagen</w:t>
       </w:r>
     </w:p>
     <w:p/>
@@ -14318,7 +14318,7 @@
         <w:ind w:left="709"/>
       </w:pPr>
       <w:r>
-        <w:t>⚡KI: Eine verdeckte Sacheinlage liegt vor, wenn eine vereinbarte Bareinlage aufgrund eines im Zusammenhang mit der Einlage getroffenem Rechtsgeschäft bei wirtschaftlicher Betrachtung durch die Einbringung des Sachwertes geleistet wird. In diesem Fall wird der Gesellschafter gem. § 19 Abs. 4 S. 1 GmbHG [[SLOT_162: § 27 Abs. 3 AktG]] nicht von seiner Einlagepflicht frei, wobei der Wert des eingebrachten Gegenstandes nach S. 3 auf die fortbestehende Forderung anzurechnen ist.]</w:t>
+        <w:t>Eine verdeckte Sacheinlage liegt vor, wenn eine vereinbarte Bareinlage aufgrund eines im Zusammenhang mit der Einlage getroffenem Rechtsgeschäft bei wirtschaftlicher Betrachtung durch die Einbringung des Sachwertes geleistet wird. In diesem Fall wird der Gesellschafter gem. § 19 Abs. 4 S. 1 GmbHG [[SLOT_162: § 27 Abs. 3 AktG]] nicht von seiner Einlagepflicht frei, wobei der Wert des eingebrachten Gegenstandes nach S. 3 auf die fortbestehende Forderung anzurechnen ist.]</w:t>
       </w:r>
     </w:p>
     <w:p/>
@@ -14331,7 +14331,7 @@
         </w:numPr>
       </w:pPr>
       <w:r>
-        <w:t>⚡KI: ⚡KI:</w:t>
+        <w:t/>
       </w:r>
     </w:p>
     <w:p/>
@@ -14392,7 +14392,7 @@
         </w:numPr>
       </w:pPr>
       <w:r>
-        <w:t>⚡KI: Existenzvernichtender Eingriff § 826 BGB</w:t>
+        <w:t>Existenzvernichtender Eingriff § 826 BGB</w:t>
       </w:r>
     </w:p>
     <w:p/>
@@ -15028,7 +15028,7 @@
         <w:rPr>
           <w:highlight w:val="yellow"/>
         </w:rPr>
-        <w:t>⚡KI: [[SLOT_165: Tabelle]]</w:t>
+        <w:t>[[SLOT_165: Tabelle]]</w:t>
       </w:r>
     </w:p>
     <w:bookmarkEnd w:id="230"/>
@@ -15078,7 +15078,7 @@
         <w:rPr>
           <w:highlight w:val="yellow"/>
         </w:rPr>
-        <w:t>⚡KI: [[SLOT_167: Tabelle]]</w:t>
+        <w:t>[[SLOT_167: Tabelle]]</w:t>
       </w:r>
     </w:p>
     <w:p/>
@@ -15140,7 +15140,7 @@
         <w:rPr>
           <w:highlight w:val="yellow"/>
         </w:rPr>
-        <w:t>⚡KI: [[SLOT_169: Tabelle]]</w:t>
+        <w:t>[[SLOT_169: Tabelle]]</w:t>
       </w:r>
       <w:bookmarkEnd w:id="233"/>
     </w:p>
@@ -15166,7 +15166,7 @@
         <w:rPr>
           <w:highlight w:val="yellow"/>
         </w:rPr>
-        <w:t>⚡KI: [[SLOT_171: Tabelle]]</w:t>
+        <w:t>[[SLOT_171: Tabelle]]</w:t>
       </w:r>
     </w:p>
     <w:p/>
@@ -15201,7 +15201,7 @@
         <w:rPr>
           <w:highlight w:val="yellow"/>
         </w:rPr>
-        <w:t>⚡KI: [[SLOT_172: Drittsicherheiten Beschreibung]]</w:t>
+        <w:t>[[SLOT_172: Drittsicherheiten Beschreibung]]</w:t>
       </w:r>
     </w:p>
     <w:p/>
@@ -15285,7 +15285,7 @@
       <w:bookmarkStart w:id="243" w:name="_Hlk77954234"/>
       <w:bookmarkStart w:id="244" w:name="_Hlk88472379"/>
       <w:r>
-        <w:t>⚡KI: Nach der Leitentscheidung des BGH vom 24.05.2005 (Az. IX ZR 123/04) liegt Zahlungsunfähigkeit im Sinne des § 17 InsO regelmäßig jedenfalls dann vor, wenn der Schuldner 10 % oder mehr seiner fälligen Gesamtverbindlichkeiten länger als drei Wochen nicht erfüllen kann, sofern nicht ausnahmsweise mit an Sicherheit grenzender Wahrscheinlichkeit zu erwarten ist, dass die Liquiditätslücke demnächst vollständig oder fast vollständig beseitigt werden wird und den Gläubigern ein Zuwarten nach den besonderen Umständen des Einzelfalls zuzumuten ist. Nach einer weiteren Grundsatzentscheidung des BGH (Beschl. v. 19.07.2007 – IX ZB 36/07) sind nur die „ernsthaft eingeforderten" fälligen Forderungen bei Feststellung der Zahlungsunfähigkeit zu berücksichtigen.</w:t>
+        <w:t>Nach der Leitentscheidung des BGH vom 24.05.2005 (Az. IX ZR 123/04) liegt Zahlungsunfähigkeit im Sinne des § 17 InsO regelmäßig jedenfalls dann vor, wenn der Schuldner 10 % oder mehr seiner fälligen Gesamtverbindlichkeiten länger als drei Wochen nicht erfüllen kann, sofern nicht ausnahmsweise mit an Sicherheit grenzender Wahrscheinlichkeit zu erwarten ist, dass die Liquiditätslücke demnächst vollständig oder fast vollständig beseitigt werden wird und den Gläubigern ein Zuwarten nach den besonderen Umständen des Einzelfalls zuzumuten ist. Nach einer weiteren Grundsatzentscheidung des BGH (Beschl. v. 19.07.2007 – IX ZB 36/07) sind nur die „ernsthaft eingeforderten" fälligen Forderungen bei Feststellung der Zahlungsunfähigkeit zu berücksichtigen.</w:t>
       </w:r>
       <w:r/>
       <w:r/>
@@ -15348,7 +15348,7 @@
         <w:rPr>
           <w:highlight w:val="yellow"/>
         </w:rPr>
-        <w:t>⚡KI: [[SLOT_173: Vorliegen Zahlungsunfähigkeit im konkreten Fall]]</w:t>
+        <w:t>[[SLOT_173: Vorliegen Zahlungsunfähigkeit im konkreten Fall]]</w:t>
       </w:r>
     </w:p>
     <w:p/>
@@ -15405,7 +15405,7 @@
         <w:ind w:left="709"/>
       </w:pPr>
       <w:r>
-        <w:t>⚡KI: Bei juristischen Personen und diesen gleichgestellten kapitalistisch organisierten Personengesellschaften ist auch die Überschuldung ein Eröffnungsgrund. Überschuldung liegt vor, wenn das Vermögen des Schuldners die bestehenden Verbindlichkeiten nicht mehr deckt, es sei denn, die Fortführung des Unternehmens in den nächsten zwölf Monaten ist nach den Umständen überwiegend wahrscheinlich (§ 19 Abs. 2 S. 1 InsO).</w:t>
+        <w:t>Bei juristischen Personen und diesen gleichgestellten kapitalistisch organisierten Personengesellschaften ist auch die Überschuldung ein Eröffnungsgrund. Überschuldung liegt vor, wenn das Vermögen des Schuldners die bestehenden Verbindlichkeiten nicht mehr deckt, es sei denn, die Fortführung des Unternehmens in den nächsten zwölf Monaten ist nach den Umständen überwiegend wahrscheinlich (§ 19 Abs. 2 S. 1 InsO).</w:t>
       </w:r>
     </w:p>
     <w:p/>
@@ -15440,7 +15440,7 @@
         <w:rPr>
           <w:highlight w:val="yellow"/>
         </w:rPr>
-        <w:t>⚡KI: [[SLOT_174: Vorliegen Zahlungsunfähigkeit im konkreten Fall]]</w:t>
+        <w:t>[[SLOT_174: Vorliegen Zahlungsunfähigkeit im konkreten Fall]]</w:t>
       </w:r>
     </w:p>
     <w:p/>
@@ -15462,7 +15462,7 @@
         <w:rPr>
           <w:szCs w:val="22"/>
         </w:rPr>
-        <w:t>⚡KI: Eintritt der Insolvenzreife</w:t>
+        <w:t>Eintritt der Insolvenzreife</w:t>
       </w:r>
       <w:bookmarkEnd w:id="254"/>
       <w:r>
@@ -15668,7 +15668,7 @@
         <w:rPr>
           <w:highlight w:val="yellow"/>
         </w:rPr>
-        <w:t>⚡KI: [[SLOT_179: Anfechtungsansprüche §§ 129 ff. InsO]]</w:t>
+        <w:t>[[SLOT_179: Anfechtungsansprüche §§ 129 ff. InsO]]</w:t>
       </w:r>
     </w:p>
     <w:p>
@@ -15972,7 +15972,7 @@
               <w:rPr>
                 <w:highlight w:val="yellow"/>
               </w:rPr>
-              <w:t>⚡KI: [[SLOT_216: Tabellenwert]] EUR</w:t>
+              <w:t>[[SLOT_216: Tabellenwert]] EUR</w:t>
             </w:r>
             <w:r/>
             <w:r/>
@@ -16006,7 +16006,7 @@
               <w:rPr>
                 <w:highlight w:val="yellow"/>
               </w:rPr>
-              <w:t>⚡KI: [[SLOT_218: Tabellenwert]] EUR</w:t>
+              <w:t>[[SLOT_218: Tabellenwert]] EUR</w:t>
             </w:r>
             <w:r/>
             <w:r/>
@@ -16040,7 +16040,7 @@
               <w:rPr>
                 <w:highlight w:val="yellow"/>
               </w:rPr>
-              <w:t>⚡KI: [[SLOT_220: Tabellenwert]] EUR</w:t>
+              <w:t>[[SLOT_220: Tabellenwert]] EUR</w:t>
             </w:r>
             <w:r/>
             <w:r/>
@@ -16084,7 +16084,7 @@
                 <w:b/>
                 <w:highlight w:val="yellow"/>
               </w:rPr>
-              <w:t>⚡KI: [[SLOT_222: Tabellenwert]] EUR</w:t>
+              <w:t>[[SLOT_222: Tabellenwert]] EUR</w:t>
             </w:r>
             <w:r>
               <w:rPr>
@@ -16177,7 +16177,7 @@
         <w:rPr>
           <w:highlight w:val="yellow"/>
         </w:rPr>
-        <w:t>⚡KI: [[SLOT_188: Ergebnis und Empfehlung des Gutachters]]</w:t>
+        <w:t>[[SLOT_188: Ergebnis und Empfehlung des Gutachters]]</w:t>
       </w:r>
     </w:p>
     <w:p/>
@@ -16324,7 +16324,7 @@
               <w:rPr>
                 <w:highlight w:val="yellow"/>
               </w:rPr>
-              <w:t>⚡KI: [[SLOT_224: Tabellenwert]]</w:t>
+              <w:t>[[SLOT_224: Tabellenwert]]</w:t>
             </w:r>
           </w:p>
         </w:tc>
@@ -16355,7 +16355,7 @@
               <w:rPr>
                 <w:highlight w:val="yellow"/>
               </w:rPr>
-              <w:t>⚡KI: [[SLOT_226: Tabellenwert]]</w:t>
+              <w:t>[[SLOT_226: Tabellenwert]]</w:t>
             </w:r>
           </w:p>
         </w:tc>
@@ -16386,7 +16386,7 @@
               <w:rPr>
                 <w:highlight w:val="yellow"/>
               </w:rPr>
-              <w:t>⚡KI: [[SLOT_228: Tabellenwert]]</w:t>
+              <w:t>[[SLOT_228: Tabellenwert]]</w:t>
             </w:r>
           </w:p>
         </w:tc>
@@ -16417,7 +16417,7 @@
               <w:rPr>
                 <w:highlight w:val="yellow"/>
               </w:rPr>
-              <w:t>⚡KI: [[SLOT_230: Tabellenwert]]</w:t>
+              <w:t>[[SLOT_230: Tabellenwert]]</w:t>
             </w:r>
           </w:p>
         </w:tc>
@@ -16448,7 +16448,7 @@
               <w:rPr>
                 <w:highlight w:val="yellow"/>
               </w:rPr>
-              <w:t>⚡KI: [[SLOT_232: Tabellenwert]]</w:t>
+              <w:t>[[SLOT_232: Tabellenwert]]</w:t>
             </w:r>
           </w:p>
         </w:tc>

</xml_diff>

<commit_message>
fix: template issues from manual Gutachten review
Template fixes:
- Remove Diktatzeichen from "vorgelegt vom Sachverständigen" line
- Replace "……." dots with KI_Verwalter_Titel placeholder
- Add space after Insolvenzgericht: and Aktenzeichen: colons
- Fix KI_Akte_LastGAVV → KI_Akte_BeschlussDat in Auftrag section
- Replace hardcoded "der Schuldnerin" with gender-aware KI_ placeholders
- Replace "Er/Sie" with KI_Verwalter gender forms
- Clean [[SLOT_]] and editorial text from TOC entries

Code:
- Add KI_Verwalter_Titel (input field) and KI_Schuldner_des_der (computed)

Co-Authored-By: Claude Opus 4.6 (1M context) <noreply@anthropic.com>
</commit_message>
<xml_diff>
--- a/gutachtenvorlagen/Gutachten Muster juristische Person.docx
+++ b/gutachtenvorlagen/Gutachten Muster juristische Person.docx
@@ -404,7 +404,7 @@
           <w:lang w:eastAsia="de-DE"/>
         </w:rPr>
         <w:tab/>
-        <w:t>……</w:t>
+        <w:t>KI_Verwalter_Titel</w:t>
       </w:r>
     </w:p>
     <w:p>
@@ -552,7 +552,7 @@
           <w:b/>
           <w:lang w:eastAsia="de-DE"/>
         </w:rPr>
-        <w:t xml:space="preserve">             Insolvenzgericht:</w:t>
+        <w:t xml:space="preserve">             Insolvenzgericht: </w:t>
       </w:r>
       <w:r>
         <w:rPr>
@@ -622,7 +622,7 @@
           <w:b/>
           <w:lang w:eastAsia="de-DE"/>
         </w:rPr>
-        <w:t xml:space="preserve">                                 Aktenzeichen:</w:t>
+        <w:t xml:space="preserve">                                 Aktenzeichen: </w:t>
       </w:r>
       <w:r>
         <w:rPr>
@@ -7052,7 +7052,7 @@
         <w:t xml:space="preserve">Steuerberater </w:t>
       </w:r>
       <w:r>
-        <w:t xml:space="preserve">der Schuldnerin </w:t>
+        <w:t xml:space="preserve">KI_Schuldner_des_der KI_Schuldner_Schuldnerin </w:t>
       </w:r>
       <w:r>
         <w:t>hat für</w:t>
@@ -10037,7 +10037,7 @@
       </w:r>
       <w:proofErr w:type="spellEnd"/>
       <w:r>
-        <w:t xml:space="preserve"> sind deutsche Gerichte für die Eröffnung des Insolvenzverfahrens über das Vermögen der Schuldnerin international zuständig.</w:t>
+        <w:t xml:space="preserve"> sind deutsche Gerichte für die Eröffnung des Insolvenzverfahrens über das Vermögen KI_Schuldner_des_der KI_Schuldner_Schuldnerin international zuständig.</w:t>
       </w:r>
     </w:p>
     <w:p>
@@ -12103,7 +12103,7 @@
         <w:ind w:left="709"/>
       </w:pPr>
       <w:r>
-        <w:t xml:space="preserve">Die Konten wurden für Verfügungen der Schuldnerin gesperrt. Seit Anordnung der vorläufigen Verwaltung werden Zahlungseingänge auf </w:t>
+        <w:t xml:space="preserve">Die Konten wurden für Verfügungen KI_Schuldner_des_der KI_Schuldner_Schuldnerin gesperrt. Seit Anordnung der vorläufigen Verwaltung werden Zahlungseingänge auf </w:t>
       </w:r>
       <w:r>
         <w:t>das</w:t>
@@ -12201,7 +12201,7 @@
         <w:rPr>
           <w:highlight w:val="yellow"/>
         </w:rPr>
-        <w:t>Er/Sie führte auch die Lohnbuchhaltung der Schuldnerin.</w:t>
+        <w:t>KI_Verwalter_Der_Die_Groß KI_Verwalter_Unterzeichner führte auch die Lohnbuchhaltung KI_Schuldner_des_der KI_Schuldner_Schuldnerin.</w:t>
       </w:r>
     </w:p>
     <w:p/>

</xml_diff>

<commit_message>
feat: add KI_* Briefkopf placeholders to juristische Person template Co-Authored-By: Claude Opus 4.6 (1M context) <noreply@anthropic.com>
</commit_message>
<xml_diff>
--- a/gutachtenvorlagen/Gutachten Muster juristische Person.docx
+++ b/gutachtenvorlagen/Gutachten Muster juristische Person.docx
@@ -26,7 +26,7 @@
         <w:jc w:val="left"/>
       </w:pPr>
       <w:r>
-        <w:t>Amtsgericht Trier</w:t>
+        <w:t>Amtsgericht KI_Gericht_Ort</w:t>
       </w:r>
     </w:p>
     <w:p>
@@ -48,7 +48,7 @@
         <w:jc w:val="left"/>
       </w:pPr>
       <w:r>
-        <w:t>Justizstraße 2-6</w:t>
+        <w:t>KI_Gericht_Adresse</w:t>
       </w:r>
     </w:p>
     <w:p>
@@ -67,19 +67,8 @@
         <w:jc w:val="left"/>
       </w:pPr>
       <w:r>
-        <w:t>54290 Trier</w:t>
-      </w:r>
-      <w:r>
-        <w:t xml:space="preserve"> </w:t>
-      </w:r>
-    </w:p>
-    <w:p>
-      <w:pPr>
-        <w:framePr w:w="5103" w:h="2279" w:hRule="exact" w:wrap="notBeside" w:vAnchor="page" w:hAnchor="page" w:x="1135" w:y="2966" w:anchorLock="1"/>
-        <w:shd w:val="solid" w:color="FFFFFF" w:fill="FFFFFF"/>
-        <w:spacing w:line="240" w:lineRule="auto"/>
-        <w:jc w:val="left"/>
-      </w:pPr>
+        <w:t>KI_Gericht_PLZ_Ort</w:t>
+      </w:r>
     </w:p>
     <w:p>
       <w:pPr>
@@ -222,15 +211,7 @@
           <w:sz w:val="16"/>
           <w:szCs w:val="16"/>
         </w:rPr>
-        <w:t>RA Ingo Grünewald</w:t>
-      </w:r>
-      <w:r>
-        <w:rPr>
-          <w:b/>
-          <w:sz w:val="16"/>
-          <w:szCs w:val="16"/>
-        </w:rPr>
-        <w:t xml:space="preserve"> </w:t>
+        <w:t>KI_Sachbearbeiter_Name</w:t>
       </w:r>
     </w:p>
     <w:p>
@@ -270,15 +251,7 @@
           <w:sz w:val="16"/>
           <w:szCs w:val="16"/>
         </w:rPr>
-        <w:t>0651 / 170 830 - 131</w:t>
-      </w:r>
-      <w:r>
-        <w:rPr>
-          <w:b/>
-          <w:sz w:val="16"/>
-          <w:szCs w:val="16"/>
-        </w:rPr>
-        <w:t xml:space="preserve"> </w:t>
+        <w:t>KI_Sachbearbeiter_Durchwahl</w:t>
       </w:r>
     </w:p>
     <w:p>
@@ -318,15 +291,7 @@
           <w:sz w:val="16"/>
           <w:szCs w:val="16"/>
         </w:rPr>
-        <w:t>0651 / 170 830 - 0</w:t>
-      </w:r>
-      <w:r>
-        <w:rPr>
-          <w:b/>
-          <w:sz w:val="16"/>
-          <w:szCs w:val="16"/>
-        </w:rPr>
-        <w:t xml:space="preserve"> </w:t>
+        <w:t>KI_Standort_Telefon</w:t>
       </w:r>
     </w:p>
     <w:p>
@@ -366,23 +331,7 @@
           <w:sz w:val="16"/>
           <w:szCs w:val="16"/>
         </w:rPr>
-        <w:t>Ingo.Gruenewald</w:t>
-      </w:r>
-      <w:r>
-        <w:rPr>
-          <w:b/>
-          <w:sz w:val="16"/>
-          <w:szCs w:val="16"/>
-        </w:rPr>
-        <w:t>@tbs-insolvenzverwalter.de</w:t>
-      </w:r>
-      <w:r>
-        <w:rPr>
-          <w:b/>
-          <w:sz w:val="16"/>
-          <w:szCs w:val="16"/>
-        </w:rPr>
-        <w:t xml:space="preserve"> </w:t>
+        <w:t>KI_Sachbearbeiter_Email</w:t>
       </w:r>
     </w:p>
     <w:p>
@@ -422,31 +371,7 @@
           <w:sz w:val="16"/>
           <w:szCs w:val="16"/>
         </w:rPr>
-        <w:t>Amtsgericht Trier</w:t>
-      </w:r>
-      <w:r>
-        <w:rPr>
-          <w:b/>
-          <w:sz w:val="16"/>
-          <w:szCs w:val="16"/>
-        </w:rPr>
-        <w:t xml:space="preserve">, Az. </w:t>
-      </w:r>
-      <w:r>
-        <w:rPr>
-          <w:b/>
-          <w:sz w:val="16"/>
-          <w:szCs w:val="16"/>
-        </w:rPr>
-        <w:t>23 IN 156/25</w:t>
-      </w:r>
-      <w:r>
-        <w:rPr>
-          <w:b/>
-          <w:sz w:val="16"/>
-          <w:szCs w:val="16"/>
-        </w:rPr>
-        <w:t xml:space="preserve"> </w:t>
+        <w:t>KI_Mein_Zeichen</w:t>
       </w:r>
     </w:p>
     <w:p>
@@ -476,8 +401,8 @@
         <w:jc w:val="right"/>
         <w:rPr>
           <w:b/>
-          <w:sz w:val="16"/>
-          <w:szCs w:val="16"/>
+          <w:sz w:val="14"/>
+          <w:szCs w:val="14"/>
         </w:rPr>
       </w:pPr>
       <w:r>
@@ -486,21 +411,8 @@
           <w:sz w:val="16"/>
           <w:szCs w:val="16"/>
         </w:rPr>
-        <w:t>23 IN 156/25</w:t>
-      </w:r>
-    </w:p>
-    <w:p>
-      <w:pPr>
-        <w:framePr w:w="4537" w:h="2656" w:hRule="exact" w:wrap="notBeside" w:vAnchor="page" w:hAnchor="page" w:x="6961" w:y="3466"/>
-        <w:shd w:val="solid" w:color="FFFFFF" w:fill="FFFFFF"/>
-        <w:spacing w:line="240" w:lineRule="auto"/>
-        <w:jc w:val="right"/>
-        <w:rPr>
-          <w:b/>
-          <w:sz w:val="14"/>
-          <w:szCs w:val="14"/>
-        </w:rPr>
-      </w:pPr>
+        <w:t>KI_Ihr_Zeichen</w:t>
+      </w:r>
     </w:p>
     <w:p/>
     <w:p/>
@@ -3309,7 +3221,7 @@
           <w:noProof/>
         </w:rPr>
         <w:drawing>
-          <wp:anchor distT="0" distB="0" distL="114300" distR="114300" simplePos="0" relativeHeight="251661312" behindDoc="0" locked="1" layoutInCell="1" allowOverlap="1" wp14:anchorId="6AABFA21" wp14:editId="704B870A">
+          <wp:anchor distT="0" distB="0" distL="114300" distR="114300" simplePos="0" relativeHeight="251661312" behindDoc="0" locked="1" layoutInCell="1" allowOverlap="1" wp14:anchorId="6AABFA21" wp14:editId="28F68B56">
             <wp:simplePos x="0" y="0"/>
             <wp:positionH relativeFrom="column">
               <wp:posOffset>5670550</wp:posOffset>
@@ -3442,32 +3354,10 @@
       </w:pPr>
     </w:p>
     <w:p>
-      <w:pPr>
-        <w:jc w:val="left"/>
-      </w:pPr>
-      <w:r>
-        <w:t>Trier</w:t>
-      </w:r>
-      <w:r>
-        <w:t xml:space="preserve">, den </w:t>
-      </w:r>
-      <w:r>
-        <w:t>1</w:t>
-      </w:r>
-      <w:r>
-        <w:t>4</w:t>
-      </w:r>
-      <w:r>
-        <w:t>.0</w:t>
-      </w:r>
-      <w:r>
-        <w:t>4</w:t>
-      </w:r>
-      <w:r>
-        <w:t>.2026</w:t>
-      </w:r>
-    </w:p>
-    <w:p/>
+      <w:r>
+        <w:t>KI_Briefkopf_Ort, den KI_Briefkopf_Datum</w:t>
+      </w:r>
+    </w:p>
     <w:p/>
     <w:p>
       <w:pPr>
@@ -3496,10 +3386,7 @@
         <w:t xml:space="preserve">in dem Insolvenzantragsverfahren über das Vermögen </w:t>
       </w:r>
       <w:r>
-        <w:t>des</w:t>
-      </w:r>
-      <w:r>
-        <w:t xml:space="preserve"> </w:t>
+        <w:t>KI_Schuldner_des_der</w:t>
       </w:r>
     </w:p>
     <w:p/>
@@ -3514,31 +3401,49 @@
         <w:rPr>
           <w:b/>
         </w:rPr>
-        <w:t>"</w:t>
-      </w:r>
-      <w:r>
+        <w:t>KI_Schuldner_Firma</w:t>
+      </w:r>
+    </w:p>
+    <w:p>
+      <w:pPr>
+        <w:jc w:val="center"/>
         <w:rPr>
           <w:b/>
         </w:rPr>
-        <w:t>freiRaum3</w:t>
-      </w:r>
+      </w:pPr>
       <w:r>
         <w:rPr>
           <w:b/>
         </w:rPr>
-        <w:t>" Südlingen 12 GmbH</w:t>
-      </w:r>
-      <w:r>
+        <w:t>KI_Schuldner_Betriebsstaette</w:t>
+      </w:r>
+    </w:p>
+    <w:p>
+      <w:pPr>
+        <w:jc w:val="center"/>
         <w:rPr>
           <w:b/>
         </w:rPr>
-        <w:t xml:space="preserve"> </w:t>
-      </w:r>
+      </w:pPr>
     </w:p>
     <w:p>
       <w:pPr>
         <w:jc w:val="center"/>
         <w:rPr>
+          <w:bCs/>
+        </w:rPr>
+      </w:pPr>
+      <w:r>
+        <w:rPr>
+          <w:bCs/>
+        </w:rPr>
+        <w:t>vertreten durch</w:t>
+      </w:r>
+    </w:p>
+    <w:p>
+      <w:pPr>
+        <w:jc w:val="center"/>
+        <w:rPr>
           <w:b/>
         </w:rPr>
       </w:pPr>
@@ -3546,233 +3451,41 @@
         <w:rPr>
           <w:b/>
         </w:rPr>
-        <w:t>Bahnhofstraße 16-18, 67742 Lauterecken</w:t>
-      </w:r>
-      <w:r>
-        <w:rPr>
-          <w:b/>
-        </w:rPr>
-        <w:t xml:space="preserve"> </w:t>
+        <w:t xml:space="preserve">KI_SCHULDNER_GESCHAEFTSFUEHRER </w:t>
       </w:r>
     </w:p>
     <w:p>
       <w:pPr>
         <w:jc w:val="center"/>
-        <w:rPr>
-          <w:b/>
-        </w:rPr>
-      </w:pPr>
-    </w:p>
-    <w:p>
-      <w:pPr>
-        <w:jc w:val="center"/>
-      </w:pPr>
-      <w:r>
-        <w:t>vertreten durch</w:t>
-      </w:r>
-    </w:p>
-    <w:p>
-      <w:pPr>
-        <w:jc w:val="center"/>
-        <w:rPr>
-          <w:b/>
-        </w:rPr>
-      </w:pPr>
-    </w:p>
-    <w:p>
-      <w:pPr>
-        <w:jc w:val="center"/>
-        <w:rPr>
-          <w:b/>
-        </w:rPr>
-      </w:pPr>
-      <w:r>
-        <w:rPr>
-          <w:b/>
-        </w:rPr>
-        <w:t>den Geschäftsführer</w:t>
-      </w:r>
-    </w:p>
-    <w:p>
-      <w:pPr>
-        <w:jc w:val="center"/>
-        <w:rPr>
-          <w:b/>
-        </w:rPr>
-      </w:pPr>
-      <w:r>
-        <w:rPr>
-          <w:b/>
-        </w:rPr>
-        <w:t>Sven Heinrich Kehrein-Seckler</w:t>
-      </w:r>
-      <w:r>
-        <w:rPr>
-          <w:b/>
-        </w:rPr>
-        <w:t xml:space="preserve"> </w:t>
-      </w:r>
-    </w:p>
-    <w:p>
-      <w:pPr>
-        <w:jc w:val="center"/>
-      </w:pPr>
-      <w:r>
-        <w:rPr>
-          <w:b/>
-        </w:rPr>
-        <w:t>Am Brückenberg 4, 67744 Lohnweiler</w:t>
+      </w:pPr>
+      <w:r>
+        <w:t>- nachfolgend „Antragsgegnerin“ -</w:t>
       </w:r>
     </w:p>
     <w:p/>
     <w:p/>
-    <w:p/>
-    <w:p/>
-    <w:p/>
-    <w:p/>
     <w:p>
       <w:pPr>
         <w:jc w:val="center"/>
-        <w:rPr>
-          <w:b/>
-        </w:rPr>
-      </w:pPr>
-      <w:r>
-        <w:rPr>
-          <w:b/>
-        </w:rPr>
-        <w:t>Gutachten</w:t>
-      </w:r>
-    </w:p>
-    <w:p/>
+      </w:pPr>
+      <w:r>
+        <w:t xml:space="preserve">Amtsgericht </w:t>
+      </w:r>
+      <w:bookmarkStart w:id="10" w:name="KI_Gericht_Ort"/>
+      <w:r>
+        <w:t>KI_Gericht_Ort</w:t>
+      </w:r>
+      <w:bookmarkEnd w:id="10"/>
+      <w:r>
+        <w:t xml:space="preserve"> </w:t>
+      </w:r>
+    </w:p>
     <w:p>
       <w:pPr>
         <w:jc w:val="center"/>
       </w:pPr>
       <w:r>
-        <w:t>in dem Insolvenzantragsverfahren über das Vermögen KI_Schuldner_des_der</w:t>
-      </w:r>
-    </w:p>
-    <w:p/>
-    <w:p>
-      <w:pPr>
-        <w:jc w:val="center"/>
-        <w:rPr>
-          <w:b/>
-        </w:rPr>
-      </w:pPr>
-      <w:r>
-        <w:rPr>
-          <w:b/>
-          <w:highlight w:val="yellow"/>
-        </w:rPr>
-        <w:t>KI_Schuldner_Firma</w:t>
-      </w:r>
-    </w:p>
-    <w:p>
-      <w:pPr>
-        <w:jc w:val="center"/>
-        <w:rPr>
-          <w:b/>
-        </w:rPr>
-      </w:pPr>
-      <w:r>
-        <w:rPr>
-          <w:b/>
-        </w:rPr>
-        <w:t>KI_Schuldner_Betriebsstaette</w:t>
-      </w:r>
-    </w:p>
-    <w:p>
-      <w:pPr>
-        <w:jc w:val="center"/>
-        <w:rPr>
-          <w:b/>
-        </w:rPr>
-      </w:pPr>
-    </w:p>
-    <w:p>
-      <w:pPr>
-        <w:jc w:val="center"/>
-        <w:rPr>
-          <w:b/>
-        </w:rPr>
-      </w:pPr>
-      <w:r>
-        <w:rPr>
-          <w:b/>
-        </w:rPr>
-        <w:t>vertreten durch</w:t>
-      </w:r>
-    </w:p>
-    <w:p>
-      <w:pPr>
-        <w:jc w:val="center"/>
-        <w:rPr>
-          <w:b/>
-        </w:rPr>
-      </w:pPr>
-      <w:bookmarkStart w:id="20" w:name="KI_SCHULDNER_GESCHAEFTSFUEHRER"/>
-      <w:r>
-        <w:rPr>
-          <w:b/>
-        </w:rPr>
-        <w:t>KI_SCHULDNER_GESCHAEFTSFUEHRER</w:t>
-      </w:r>
-      <w:bookmarkEnd w:id="20"/>
-      <w:r>
-        <w:rPr>
-          <w:b/>
-        </w:rPr>
-        <w:t xml:space="preserve"> </w:t>
-      </w:r>
-    </w:p>
-    <w:p>
-      <w:r>
-        <w:t>(Geschäftsführer)</w:t>
-      </w:r>
-    </w:p>
-    <w:p>
-      <w:r>
-        <w:t>- nachfolgend „Antragsgegnerin“ -</w:t>
-      </w:r>
-    </w:p>
-    <w:p/>
-    <w:p/>
-    <w:p/>
-    <w:p/>
-    <w:p/>
-    <w:p/>
-    <w:p/>
-    <w:p/>
-    <w:p/>
-    <w:p>
-      <w:pPr>
-        <w:jc w:val="center"/>
-      </w:pPr>
-      <w:r>
-        <w:t xml:space="preserve">Amtsgericht </w:t>
-      </w:r>
-      <w:bookmarkStart w:id="21" w:name="KI_Gericht_Ort"/>
-      <w:r>
-        <w:t>KI_Gericht_Ort</w:t>
-      </w:r>
-      <w:bookmarkEnd w:id="21"/>
-      <w:r>
-        <w:t xml:space="preserve"> </w:t>
-      </w:r>
-    </w:p>
-    <w:p>
-      <w:pPr>
-        <w:jc w:val="center"/>
-        <w:rPr>
-          <w:highlight w:val="yellow"/>
-        </w:rPr>
-      </w:pPr>
-      <w:r>
-        <w:rPr>
-          <w:highlight w:val="yellow"/>
-        </w:rPr>
+        <w:lastRenderedPageBreak/>
         <w:t>-KI_Akte_GerichtAZ-</w:t>
       </w:r>
     </w:p>
@@ -3813,7 +3526,7 @@
           <w:lang w:eastAsia="de-DE"/>
         </w:rPr>
         <w:lastRenderedPageBreak/>
-        <w:t>vorg</w:t>
+        <w:t xml:space="preserve">vorgelegt vom Sachverständigen: </w:t>
       </w:r>
       <w:r>
         <w:rPr>
@@ -3822,8 +3535,10 @@
           <w:color w:val="000000"/>
           <w:lang w:eastAsia="de-DE"/>
         </w:rPr>
-        <w:t xml:space="preserve">elegt vom Sachverständigen: </w:t>
-      </w:r>
+        <w:tab/>
+        <w:t xml:space="preserve">RA </w:t>
+      </w:r>
+      <w:bookmarkStart w:id="11" w:name="KI_Verwalter_Name"/>
       <w:r>
         <w:rPr>
           <w:rFonts w:eastAsia="Times New Roman" w:cs="Arial"/>
@@ -3831,20 +3546,9 @@
           <w:color w:val="000000"/>
           <w:lang w:eastAsia="de-DE"/>
         </w:rPr>
-        <w:tab/>
-        <w:t xml:space="preserve">RA </w:t>
-      </w:r>
-      <w:bookmarkStart w:id="22" w:name="KI_Verwalter_Name"/>
-      <w:r>
-        <w:rPr>
-          <w:rFonts w:eastAsia="Times New Roman" w:cs="Arial"/>
-          <w:b/>
-          <w:color w:val="000000"/>
-          <w:lang w:eastAsia="de-DE"/>
-        </w:rPr>
         <w:t>KI_Verwalter_Name</w:t>
       </w:r>
-      <w:bookmarkEnd w:id="22"/>
+      <w:bookmarkEnd w:id="11"/>
       <w:r>
         <w:rPr>
           <w:rFonts w:eastAsia="Times New Roman" w:cs="Arial"/>
@@ -3869,6 +3573,15 @@
           <w:lang w:eastAsia="de-DE"/>
         </w:rPr>
       </w:pPr>
+      <w:r>
+        <w:rPr>
+          <w:rFonts w:eastAsia="Times New Roman" w:cs="Arial"/>
+          <w:color w:val="000000"/>
+          <w:lang w:eastAsia="de-DE"/>
+        </w:rPr>
+        <w:tab/>
+        <w:t>KI_Verwalter_Titel</w:t>
+      </w:r>
     </w:p>
     <w:p>
       <w:pPr>
@@ -3881,7 +3594,6 @@
         <w:rPr>
           <w:rFonts w:eastAsia="Times New Roman" w:cs="Arial"/>
           <w:color w:val="000000"/>
-          <w:highlight w:val="yellow"/>
           <w:lang w:eastAsia="de-DE"/>
         </w:rPr>
       </w:pPr>
@@ -3907,41 +3619,17 @@
           <w:lang w:eastAsia="de-DE"/>
         </w:rPr>
         <w:tab/>
-        <w:t>KI_Verwalter_Titel</w:t>
-      </w:r>
-    </w:p>
-    <w:p>
-      <w:pPr>
-        <w:tabs>
-          <w:tab w:val="left" w:pos="3969"/>
-        </w:tabs>
-        <w:autoSpaceDE w:val="0"/>
-        <w:adjustRightInd w:val="0"/>
-        <w:jc w:val="left"/>
+      </w:r>
+      <w:bookmarkStart w:id="12" w:name="KI_Verwalter_Adr"/>
+      <w:r>
         <w:rPr>
           <w:rFonts w:eastAsia="Times New Roman" w:cs="Arial"/>
           <w:color w:val="000000"/>
           <w:lang w:eastAsia="de-DE"/>
         </w:rPr>
-      </w:pPr>
-      <w:r>
-        <w:rPr>
-          <w:rFonts w:eastAsia="Times New Roman" w:cs="Arial"/>
-          <w:color w:val="000000"/>
-          <w:lang w:eastAsia="de-DE"/>
-        </w:rPr>
-        <w:tab/>
-      </w:r>
-      <w:bookmarkStart w:id="23" w:name="KI_Verwalter_Adr"/>
-      <w:r>
-        <w:rPr>
-          <w:rFonts w:eastAsia="Times New Roman" w:cs="Arial"/>
-          <w:color w:val="000000"/>
-          <w:lang w:eastAsia="de-DE"/>
-        </w:rPr>
         <w:t>KI_Verwalter_Adr</w:t>
       </w:r>
-      <w:bookmarkEnd w:id="23"/>
+      <w:bookmarkEnd w:id="12"/>
       <w:r>
         <w:rPr>
           <w:rFonts w:eastAsia="Times New Roman" w:cs="Arial"/>
@@ -3979,7 +3667,7 @@
           <w:noProof/>
           <w:lang w:eastAsia="de-DE"/>
         </w:rPr>
-        <w:pict w14:anchorId="675F8E78">
+        <w:pict w14:anchorId="3E3D1585">
           <v:shapetype id="_x0000_t75" coordsize="21600,21600" o:spt="75" o:preferrelative="t" path="m@4@5l@4@11@9@11@9@5xe" filled="f" stroked="f">
             <v:stroke joinstyle="miter"/>
             <v:formulas>
@@ -3999,7 +3687,7 @@
             <v:path o:extrusionok="f" gradientshapeok="t" o:connecttype="rect"/>
             <o:lock v:ext="edit" aspectratio="t"/>
           </v:shapetype>
-          <v:shape id="_x0000_i1025" type="#_x0000_t75" alt="" style="width:116.05pt;height:81.6pt;mso-width-percent:0;mso-height-percent:0;mso-width-percent:0;mso-height-percent:0">
+          <v:shape id="_x0000_i1025" type="#_x0000_t75" alt="" style="width:115.85pt;height:81.95pt;mso-width-percent:0;mso-height-percent:0;mso-width-percent:0;mso-height-percent:0">
             <v:imagedata r:id="rId10" o:title="Logo_Schmidt_180x180px" croptop="8033f" cropbottom="11416f"/>
           </v:shape>
         </w:pict>
@@ -4032,7 +3720,7 @@
           <w:b/>
           <w:lang w:eastAsia="de-DE"/>
         </w:rPr>
-        <w:t xml:space="preserve">             </w:t>
+        <w:t xml:space="preserve">                          Insolvenzgericht: </w:t>
       </w:r>
       <w:r>
         <w:rPr>
@@ -4040,39 +3728,43 @@
           <w:b/>
           <w:lang w:eastAsia="de-DE"/>
         </w:rPr>
-        <w:t xml:space="preserve">             Insolvenzgericht: </w:t>
-      </w:r>
-      <w:r>
+        <w:tab/>
+      </w:r>
+      <w:r>
+        <w:rPr>
+          <w:rFonts w:eastAsia="Times New Roman" w:cs="Arial"/>
+          <w:lang w:eastAsia="de-DE"/>
+        </w:rPr>
+        <w:t xml:space="preserve">Amtsgericht </w:t>
+      </w:r>
+      <w:bookmarkStart w:id="13" w:name="KI_Gericht_Ort_002"/>
+      <w:r>
+        <w:rPr>
+          <w:rFonts w:eastAsia="Times New Roman" w:cs="Arial"/>
+          <w:lang w:eastAsia="de-DE"/>
+        </w:rPr>
+        <w:t>KI_Gericht_Ort</w:t>
+      </w:r>
+      <w:bookmarkEnd w:id="13"/>
+      <w:r>
+        <w:rPr>
+          <w:rFonts w:eastAsia="Times New Roman" w:cs="Arial"/>
+          <w:lang w:eastAsia="de-DE"/>
+        </w:rPr>
+        <w:t xml:space="preserve"> </w:t>
+      </w:r>
+    </w:p>
+    <w:p>
+      <w:pPr>
+        <w:tabs>
+          <w:tab w:val="left" w:pos="3969"/>
+        </w:tabs>
         <w:rPr>
           <w:rFonts w:eastAsia="Times New Roman" w:cs="Arial"/>
           <w:b/>
           <w:lang w:eastAsia="de-DE"/>
         </w:rPr>
-        <w:tab/>
-      </w:r>
-      <w:r>
-        <w:rPr>
-          <w:rFonts w:eastAsia="Times New Roman" w:cs="Arial"/>
-          <w:lang w:eastAsia="de-DE"/>
-        </w:rPr>
-        <w:t xml:space="preserve">Amtsgericht </w:t>
-      </w:r>
-      <w:bookmarkStart w:id="24" w:name="KI_Gericht_Ort_002"/>
-      <w:r>
-        <w:rPr>
-          <w:rFonts w:eastAsia="Times New Roman" w:cs="Arial"/>
-          <w:lang w:eastAsia="de-DE"/>
-        </w:rPr>
-        <w:t>KI_Gericht_Ort</w:t>
-      </w:r>
-      <w:bookmarkEnd w:id="24"/>
-      <w:r>
-        <w:rPr>
-          <w:rFonts w:eastAsia="Times New Roman" w:cs="Arial"/>
-          <w:lang w:eastAsia="de-DE"/>
-        </w:rPr>
-        <w:t xml:space="preserve"> </w:t>
-      </w:r>
+      </w:pPr>
     </w:p>
     <w:p>
       <w:pPr>
@@ -4081,18 +3773,6 @@
         </w:tabs>
         <w:rPr>
           <w:rFonts w:eastAsia="Times New Roman" w:cs="Arial"/>
-          <w:b/>
-          <w:lang w:eastAsia="de-DE"/>
-        </w:rPr>
-      </w:pPr>
-    </w:p>
-    <w:p>
-      <w:pPr>
-        <w:tabs>
-          <w:tab w:val="left" w:pos="3969"/>
-        </w:tabs>
-        <w:rPr>
-          <w:rFonts w:eastAsia="Times New Roman" w:cs="Arial"/>
           <w:lang w:eastAsia="de-DE"/>
         </w:rPr>
       </w:pPr>
@@ -4112,7 +3792,7 @@
         </w:rPr>
         <w:tab/>
       </w:r>
-      <w:bookmarkStart w:id="25" w:name="KI_Akte_GerichtAZ_002"/>
+      <w:bookmarkStart w:id="14" w:name="KI_Akte_GerichtAZ_002"/>
       <w:r>
         <w:rPr>
           <w:rFonts w:eastAsia="Times New Roman" w:cs="Arial"/>
@@ -4121,22 +3801,14 @@
         </w:rPr>
         <w:t>KI_Akte_GerichtAZ</w:t>
       </w:r>
-      <w:bookmarkEnd w:id="25"/>
+      <w:bookmarkEnd w:id="14"/>
       <w:r>
         <w:rPr>
           <w:rFonts w:eastAsia="Times New Roman" w:cs="Arial"/>
           <w:b/>
           <w:lang w:eastAsia="de-DE"/>
         </w:rPr>
-        <w:t xml:space="preserve"> </w:t>
-      </w:r>
-      <w:r>
-        <w:rPr>
-          <w:rFonts w:eastAsia="Times New Roman" w:cs="Arial"/>
-          <w:b/>
-          <w:lang w:eastAsia="de-DE"/>
-        </w:rPr>
-        <w:t xml:space="preserve"> </w:t>
+        <w:t xml:space="preserve">  </w:t>
       </w:r>
     </w:p>
     <w:p>
@@ -9814,9 +9486,9 @@
           <w:szCs w:val="22"/>
         </w:rPr>
       </w:pPr>
-      <w:bookmarkStart w:id="26" w:name="_Toc3475016"/>
-      <w:bookmarkStart w:id="27" w:name="_Toc134620874"/>
-      <w:bookmarkStart w:id="28" w:name="_Toc202967537"/>
+      <w:bookmarkStart w:id="15" w:name="_Toc3475016"/>
+      <w:bookmarkStart w:id="16" w:name="_Toc134620874"/>
+      <w:bookmarkStart w:id="17" w:name="_Toc202967537"/>
       <w:r>
         <w:rPr>
           <w:szCs w:val="22"/>
@@ -9824,9 +9496,9 @@
         <w:lastRenderedPageBreak/>
         <w:t>Gutachtenauftrag und Grundlagen für das Gutachten</w:t>
       </w:r>
-      <w:bookmarkEnd w:id="26"/>
-      <w:bookmarkEnd w:id="27"/>
-      <w:bookmarkEnd w:id="28"/>
+      <w:bookmarkEnd w:id="15"/>
+      <w:bookmarkEnd w:id="16"/>
+      <w:bookmarkEnd w:id="17"/>
     </w:p>
     <w:p/>
     <w:p/>
@@ -9841,16 +9513,16 @@
           <w:szCs w:val="22"/>
         </w:rPr>
       </w:pPr>
-      <w:bookmarkStart w:id="29" w:name="_Toc134620875"/>
-      <w:bookmarkStart w:id="30" w:name="_Toc202967538"/>
+      <w:bookmarkStart w:id="18" w:name="_Toc134620875"/>
+      <w:bookmarkStart w:id="19" w:name="_Toc202967538"/>
       <w:r>
         <w:rPr>
           <w:szCs w:val="22"/>
         </w:rPr>
         <w:t>Auftrag</w:t>
       </w:r>
-      <w:bookmarkEnd w:id="29"/>
-      <w:bookmarkEnd w:id="30"/>
+      <w:bookmarkEnd w:id="18"/>
+      <w:bookmarkEnd w:id="19"/>
     </w:p>
     <w:p/>
     <w:p>
@@ -10091,16 +9763,16 @@
           <w:szCs w:val="22"/>
         </w:rPr>
       </w:pPr>
-      <w:bookmarkStart w:id="31" w:name="_Toc134620876"/>
-      <w:bookmarkStart w:id="32" w:name="_Toc202967539"/>
+      <w:bookmarkStart w:id="20" w:name="_Toc134620876"/>
+      <w:bookmarkStart w:id="21" w:name="_Toc202967539"/>
       <w:r>
         <w:rPr>
           <w:szCs w:val="22"/>
         </w:rPr>
         <w:t>Grundlagen</w:t>
       </w:r>
-      <w:bookmarkEnd w:id="31"/>
-      <w:bookmarkEnd w:id="32"/>
+      <w:bookmarkEnd w:id="20"/>
+      <w:bookmarkEnd w:id="21"/>
     </w:p>
     <w:p/>
     <w:p>
@@ -10129,16 +9801,16 @@
           <w:szCs w:val="22"/>
         </w:rPr>
       </w:pPr>
-      <w:bookmarkStart w:id="33" w:name="_Toc134620877"/>
-      <w:bookmarkStart w:id="34" w:name="_Toc202967540"/>
+      <w:bookmarkStart w:id="22" w:name="_Toc134620877"/>
+      <w:bookmarkStart w:id="23" w:name="_Toc202967540"/>
       <w:r>
         <w:rPr>
           <w:szCs w:val="22"/>
         </w:rPr>
         <w:t>Unterlagen</w:t>
       </w:r>
-      <w:bookmarkEnd w:id="33"/>
-      <w:bookmarkEnd w:id="34"/>
+      <w:bookmarkEnd w:id="22"/>
+      <w:bookmarkEnd w:id="23"/>
     </w:p>
     <w:p>
       <w:pPr>
@@ -10221,16 +9893,16 @@
           <w:szCs w:val="22"/>
         </w:rPr>
       </w:pPr>
-      <w:bookmarkStart w:id="35" w:name="_Toc134620878"/>
-      <w:bookmarkStart w:id="36" w:name="_Toc202967541"/>
+      <w:bookmarkStart w:id="24" w:name="_Toc134620878"/>
+      <w:bookmarkStart w:id="25" w:name="_Toc202967541"/>
       <w:r>
         <w:rPr>
           <w:szCs w:val="22"/>
         </w:rPr>
         <w:t>Auskunftspersonen</w:t>
       </w:r>
-      <w:bookmarkEnd w:id="35"/>
-      <w:bookmarkEnd w:id="36"/>
+      <w:bookmarkEnd w:id="24"/>
+      <w:bookmarkEnd w:id="25"/>
     </w:p>
     <w:p>
       <w:pPr>
@@ -10273,22 +9945,22 @@
           <w:szCs w:val="22"/>
         </w:rPr>
       </w:pPr>
-      <w:bookmarkStart w:id="37" w:name="_Toc134620879"/>
-      <w:bookmarkStart w:id="38" w:name="_Toc202967542"/>
+      <w:bookmarkStart w:id="26" w:name="_Toc134620879"/>
+      <w:bookmarkStart w:id="27" w:name="_Toc202967542"/>
       <w:r>
         <w:rPr>
           <w:szCs w:val="22"/>
         </w:rPr>
         <w:t>Erklärung gem. § 4 der Berufsgrundsätze der Insolvenzverwalter des Verbandes der Insolvenzverwalter Deutschlands e.V. (VID)</w:t>
       </w:r>
-      <w:bookmarkEnd w:id="37"/>
+      <w:bookmarkEnd w:id="26"/>
       <w:r>
         <w:rPr>
           <w:szCs w:val="22"/>
         </w:rPr>
         <w:t xml:space="preserve"> zur Unabhängigkeit und den geforderten Qualitätsstandards</w:t>
       </w:r>
-      <w:bookmarkEnd w:id="38"/>
+      <w:bookmarkEnd w:id="27"/>
     </w:p>
     <w:p>
       <w:pPr>
@@ -10338,7 +10010,7 @@
       <w:pPr>
         <w:ind w:left="709"/>
       </w:pPr>
-      <w:bookmarkStart w:id="39" w:name="_Hlk88471580"/>
+      <w:bookmarkStart w:id="28" w:name="_Hlk88471580"/>
       <w:r>
         <w:rPr>
           <w:highlight w:val="yellow"/>
@@ -10352,11 +10024,11 @@
         <w:lastRenderedPageBreak/>
         <w:t>verpflichtete geschäftskundige Wahrer der Interessen aller im Insolvenzverfahren Beteiligten. Die erforderliche Unabhängigkeit des Unterzeichners und der geforderte Qualitätsstandard sind durch die Zertifizierung nach ISO 9001:2015 und GOI (Grundsätze ordnungsgemäßer Insolvenzverwaltung nach VID) gegeben. Die Zertifizierung wurde zuletzt am 15.07.2025 erneuert.</w:t>
       </w:r>
-      <w:bookmarkStart w:id="40" w:name="KI_Verwalter_des_der_002"/>
-      <w:bookmarkStart w:id="41" w:name="KI_Verwalter_Unterzeichner_Genitiv_002"/>
-      <w:bookmarkEnd w:id="39"/>
-      <w:bookmarkEnd w:id="40"/>
-      <w:bookmarkEnd w:id="41"/>
+      <w:bookmarkStart w:id="29" w:name="KI_Verwalter_des_der_002"/>
+      <w:bookmarkStart w:id="30" w:name="KI_Verwalter_Unterzeichner_Genitiv_002"/>
+      <w:bookmarkEnd w:id="28"/>
+      <w:bookmarkEnd w:id="29"/>
+      <w:bookmarkEnd w:id="30"/>
     </w:p>
     <w:p>
       <w:pPr>
@@ -10379,18 +10051,18 @@
           <w:szCs w:val="22"/>
         </w:rPr>
       </w:pPr>
-      <w:bookmarkStart w:id="42" w:name="_Toc3475017"/>
-      <w:bookmarkStart w:id="43" w:name="_Toc134620880"/>
-      <w:bookmarkStart w:id="44" w:name="_Toc202967543"/>
+      <w:bookmarkStart w:id="31" w:name="_Toc3475017"/>
+      <w:bookmarkStart w:id="32" w:name="_Toc134620880"/>
+      <w:bookmarkStart w:id="33" w:name="_Toc202967543"/>
       <w:r>
         <w:rPr>
           <w:szCs w:val="22"/>
         </w:rPr>
         <w:t>Allgemeine Angaben</w:t>
       </w:r>
-      <w:bookmarkEnd w:id="42"/>
-      <w:bookmarkEnd w:id="43"/>
-      <w:bookmarkEnd w:id="44"/>
+      <w:bookmarkEnd w:id="31"/>
+      <w:bookmarkEnd w:id="32"/>
+      <w:bookmarkEnd w:id="33"/>
     </w:p>
     <w:p>
       <w:pPr>
@@ -10413,9 +10085,9 @@
           <w:szCs w:val="22"/>
         </w:rPr>
       </w:pPr>
-      <w:bookmarkStart w:id="45" w:name="_Toc3475018"/>
-      <w:bookmarkStart w:id="46" w:name="_Toc134620881"/>
-      <w:bookmarkStart w:id="47" w:name="_Toc202967544"/>
+      <w:bookmarkStart w:id="34" w:name="_Toc3475018"/>
+      <w:bookmarkStart w:id="35" w:name="_Toc134620881"/>
+      <w:bookmarkStart w:id="36" w:name="_Toc202967544"/>
       <w:r>
         <w:rPr>
           <w:szCs w:val="22"/>
@@ -10423,29 +10095,22 @@
         </w:rPr>
         <w:t>Angaben zur Schuldner</w:t>
       </w:r>
-      <w:bookmarkEnd w:id="45"/>
+      <w:bookmarkEnd w:id="34"/>
       <w:r>
         <w:rPr>
           <w:szCs w:val="22"/>
           <w:highlight w:val="yellow"/>
         </w:rPr>
-        <w:t>in</w:t>
+        <w:t>in/zum Schuldner</w:t>
       </w:r>
       <w:r>
         <w:rPr>
           <w:szCs w:val="22"/>
-          <w:highlight w:val="yellow"/>
-        </w:rPr>
-        <w:t>/zum Schuldner</w:t>
-      </w:r>
-      <w:r>
-        <w:rPr>
-          <w:szCs w:val="22"/>
         </w:rPr>
         <w:t xml:space="preserve"> / Statistische Angaben</w:t>
       </w:r>
-      <w:bookmarkEnd w:id="46"/>
-      <w:bookmarkEnd w:id="47"/>
+      <w:bookmarkEnd w:id="35"/>
+      <w:bookmarkEnd w:id="36"/>
     </w:p>
     <w:p>
       <w:pPr>
@@ -10463,16 +10128,16 @@
           <w:szCs w:val="22"/>
         </w:rPr>
       </w:pPr>
-      <w:bookmarkStart w:id="48" w:name="_Toc134620882"/>
-      <w:bookmarkStart w:id="49" w:name="_Toc202967545"/>
+      <w:bookmarkStart w:id="37" w:name="_Toc134620882"/>
+      <w:bookmarkStart w:id="38" w:name="_Toc202967545"/>
       <w:r>
         <w:rPr>
           <w:szCs w:val="22"/>
         </w:rPr>
         <w:t>Statistische Angaben</w:t>
       </w:r>
-      <w:bookmarkEnd w:id="48"/>
-      <w:bookmarkEnd w:id="49"/>
+      <w:bookmarkEnd w:id="37"/>
+      <w:bookmarkEnd w:id="38"/>
     </w:p>
     <w:p>
       <w:pPr>
@@ -10772,14 +10437,7 @@
                 <w:sz w:val="18"/>
                 <w:szCs w:val="18"/>
               </w:rPr>
-              <w:t xml:space="preserve">KI_Forderungen_Gesamt KI_Forderungen_Gesichert </w:t>
-            </w:r>
-            <w:r>
-              <w:rPr>
-                <w:sz w:val="18"/>
-                <w:szCs w:val="18"/>
-              </w:rPr>
-              <w:t>[[SLOT_013: Nachrangige Forderungen]]</w:t>
+              <w:t>KI_Forderungen_Gesamt KI_Forderungen_Gesichert [[SLOT_013: Nachrangige Forderungen]]</w:t>
             </w:r>
           </w:p>
         </w:tc>
@@ -11198,16 +10856,16 @@
           <w:szCs w:val="22"/>
         </w:rPr>
       </w:pPr>
-      <w:bookmarkStart w:id="50" w:name="_Toc134620899"/>
-      <w:bookmarkStart w:id="51" w:name="_Toc202967546"/>
+      <w:bookmarkStart w:id="39" w:name="_Toc134620899"/>
+      <w:bookmarkStart w:id="40" w:name="_Toc202967546"/>
       <w:r>
         <w:rPr>
           <w:szCs w:val="22"/>
         </w:rPr>
         <w:t>Gesellschaftsrechtliche Angaben</w:t>
       </w:r>
-      <w:bookmarkEnd w:id="50"/>
-      <w:bookmarkEnd w:id="51"/>
+      <w:bookmarkEnd w:id="39"/>
+      <w:bookmarkEnd w:id="40"/>
     </w:p>
     <w:p>
       <w:pPr>
@@ -11610,16 +11268,16 @@
           <w:szCs w:val="22"/>
         </w:rPr>
       </w:pPr>
-      <w:bookmarkStart w:id="52" w:name="_Toc134620909"/>
-      <w:bookmarkStart w:id="53" w:name="_Toc202967547"/>
+      <w:bookmarkStart w:id="41" w:name="_Toc134620909"/>
+      <w:bookmarkStart w:id="42" w:name="_Toc202967547"/>
       <w:r>
         <w:rPr>
           <w:szCs w:val="22"/>
         </w:rPr>
         <w:t>Steuerrechtliche Angaben</w:t>
       </w:r>
-      <w:bookmarkEnd w:id="52"/>
-      <w:bookmarkEnd w:id="53"/>
+      <w:bookmarkEnd w:id="41"/>
+      <w:bookmarkEnd w:id="42"/>
     </w:p>
     <w:p/>
     <w:tbl>
@@ -11840,8 +11498,8 @@
           <w:szCs w:val="22"/>
         </w:rPr>
       </w:pPr>
-      <w:bookmarkStart w:id="54" w:name="_Toc134620916"/>
-      <w:bookmarkStart w:id="55" w:name="_Toc202967548"/>
+      <w:bookmarkStart w:id="43" w:name="_Toc134620916"/>
+      <w:bookmarkStart w:id="44" w:name="_Toc202967548"/>
       <w:r>
         <w:rPr>
           <w:szCs w:val="22"/>
@@ -11849,8 +11507,8 @@
         <w:lastRenderedPageBreak/>
         <w:t>Sonstige Angaben</w:t>
       </w:r>
-      <w:bookmarkEnd w:id="54"/>
-      <w:bookmarkEnd w:id="55"/>
+      <w:bookmarkEnd w:id="43"/>
+      <w:bookmarkEnd w:id="44"/>
     </w:p>
     <w:p>
       <w:pPr>
@@ -12347,18 +12005,18 @@
           <w:szCs w:val="22"/>
         </w:rPr>
       </w:pPr>
-      <w:bookmarkStart w:id="56" w:name="_Toc3475020"/>
-      <w:bookmarkStart w:id="57" w:name="_Toc134620928"/>
-      <w:bookmarkStart w:id="58" w:name="_Toc202967549"/>
+      <w:bookmarkStart w:id="45" w:name="_Toc3475020"/>
+      <w:bookmarkStart w:id="46" w:name="_Toc134620928"/>
+      <w:bookmarkStart w:id="47" w:name="_Toc202967549"/>
       <w:r>
         <w:rPr>
           <w:szCs w:val="22"/>
         </w:rPr>
         <w:t>Angaben zum Verfahren</w:t>
       </w:r>
-      <w:bookmarkEnd w:id="56"/>
-      <w:bookmarkEnd w:id="57"/>
-      <w:bookmarkEnd w:id="58"/>
+      <w:bookmarkEnd w:id="45"/>
+      <w:bookmarkEnd w:id="46"/>
+      <w:bookmarkEnd w:id="47"/>
     </w:p>
     <w:p>
       <w:pPr>
@@ -12390,8 +12048,8 @@
           <w:highlight w:val="yellow"/>
         </w:rPr>
       </w:pPr>
-      <w:bookmarkStart w:id="59" w:name="_Toc134620929"/>
-      <w:bookmarkStart w:id="60" w:name="_Toc202967550"/>
+      <w:bookmarkStart w:id="48" w:name="_Toc134620929"/>
+      <w:bookmarkStart w:id="49" w:name="_Toc202967550"/>
       <w:r>
         <w:rPr>
           <w:szCs w:val="22"/>
@@ -12399,15 +12057,15 @@
         </w:rPr>
         <w:t>Internationale Zuständigkeit deutscher Gerichte</w:t>
       </w:r>
-      <w:bookmarkEnd w:id="59"/>
-      <w:bookmarkEnd w:id="60"/>
+      <w:bookmarkEnd w:id="48"/>
+      <w:bookmarkEnd w:id="49"/>
     </w:p>
     <w:p/>
     <w:p>
       <w:pPr>
         <w:ind w:left="709"/>
       </w:pPr>
-      <w:bookmarkStart w:id="61" w:name="_Hlk88471927"/>
+      <w:bookmarkStart w:id="50" w:name="_Hlk88471927"/>
       <w:r>
         <w:t>Gem. Art. 3 Abs. 1 EuInsVO sind deutsche Gerichte für die Eröffnung des Insolvenzverfahrens über das Vermögen KI_Schuldner_des_der KI_Schuldner_Schuldnerin international zuständig.</w:t>
       </w:r>
@@ -12432,13 +12090,7 @@
           <w:highlight w:val="yellow"/>
         </w:rPr>
         <w:lastRenderedPageBreak/>
-        <w:t>„qualifizierter grenzüberschreitender Bezug“), sondern beansprucht für die Gerichte der Mitgliedsstaaten der EuInsVO auch Geltung, wenn der grenzüberschreitende Bezug zu einem Nicht-Mitgliedsstaat der EuInsVO besteht (sog. „einfacher grenzüberschreitender Bezug“ oder „Drittstaatenbezug“; zum Ganzen: MüKo InsO/Reinhart, VO (EU) 2015/848 Art. 1 Rn. 29; Uhlenbruck/Knof, VO (EU) 2015/848 Art. 1 Rn. 2-11; K. Schmidt/Brinkmann, VO (EU) 2015/848 Art. 1 Rn. 17). Insofern hat das deutsche internationale Insolvenzrec</w:t>
-      </w:r>
-      <w:r>
-        <w:rPr>
-          <w:highlight w:val="yellow"/>
-        </w:rPr>
-        <w:t>ht der §§ 335 ff. InsO lediglich einen Anwendungsbereich, soweit die EuInsVO einen Sachverhalt nicht regelt (z.B. die Fälle des Art. 1 Abs. 2 EuInsVO).</w:t>
+        <w:t>„qualifizierter grenzüberschreitender Bezug“), sondern beansprucht für die Gerichte der Mitgliedsstaaten der EuInsVO auch Geltung, wenn der grenzüberschreitende Bezug zu einem Nicht-Mitgliedsstaat der EuInsVO besteht (sog. „einfacher grenzüberschreitender Bezug“ oder „Drittstaatenbezug“; zum Ganzen: MüKo InsO/Reinhart, VO (EU) 2015/848 Art. 1 Rn. 29; Uhlenbruck/Knof, VO (EU) 2015/848 Art. 1 Rn. 2-11; K. Schmidt/Brinkmann, VO (EU) 2015/848 Art. 1 Rn. 17). Insofern hat das deutsche internationale Insolvenzrecht der §§ 335 ff. InsO lediglich einen Anwendungsbereich, soweit die EuInsVO einen Sachverhalt nicht regelt (z.B. die Fälle des Art. 1 Abs. 2 EuInsVO).</w:t>
       </w:r>
     </w:p>
     <w:p>
@@ -12451,10 +12103,7 @@
         <w:ind w:left="709"/>
       </w:pPr>
       <w:r>
-        <w:t>Nach Art. 3 Abs. 1 EuInsVO</w:t>
-      </w:r>
-      <w:r>
-        <w:t xml:space="preserve"> sind für die Eröffnung des Insolvenzverfahrens die Gerichte des Mitgliedstaates zuständig, in dessen Gebiet der Schuldner den Mittelpunkt seiner hauptsächlichen Interessen (= centre of main interests, sog. „COMI“) hat. Der COMI ist in Art. 3 Abs. 1 Satz 2 EuInsVO als der Ort definiert, an dem der Schuldner gewöhnlich der Verwaltung seiner Interessen nachgeht und der für Dritte feststellbar ist.</w:t>
+        <w:t>Nach Art. 3 Abs. 1 EuInsVO sind für die Eröffnung des Insolvenzverfahrens die Gerichte des Mitgliedstaates zuständig, in dessen Gebiet der Schuldner den Mittelpunkt seiner hauptsächlichen Interessen (= centre of main interests, sog. „COMI“) hat. Der COMI ist in Art. 3 Abs. 1 Satz 2 EuInsVO als der Ort definiert, an dem der Schuldner gewöhnlich der Verwaltung seiner Interessen nachgeht und der für Dritte feststellbar ist.</w:t>
       </w:r>
     </w:p>
     <w:p>
@@ -12467,7 +12116,7 @@
         <w:ind w:left="709"/>
       </w:pPr>
     </w:p>
-    <w:bookmarkEnd w:id="61"/>
+    <w:bookmarkEnd w:id="50"/>
     <w:p>
       <w:pPr>
         <w:pStyle w:val="123"/>
@@ -12484,16 +12133,16 @@
           <w:szCs w:val="22"/>
         </w:rPr>
       </w:pPr>
-      <w:bookmarkStart w:id="62" w:name="_Toc134620930"/>
-      <w:bookmarkStart w:id="63" w:name="_Toc202967551"/>
+      <w:bookmarkStart w:id="51" w:name="_Toc134620930"/>
+      <w:bookmarkStart w:id="52" w:name="_Toc202967551"/>
       <w:r>
         <w:rPr>
           <w:szCs w:val="22"/>
         </w:rPr>
         <w:t>Örtliche Zuständigkeit des Amtsgerichts KI_Gericht_Ort, gem. § 3 Abs. 1 InsO</w:t>
       </w:r>
-      <w:bookmarkEnd w:id="62"/>
-      <w:bookmarkEnd w:id="63"/>
+      <w:bookmarkEnd w:id="51"/>
+      <w:bookmarkEnd w:id="52"/>
     </w:p>
     <w:p/>
     <w:p>
@@ -12501,10 +12150,7 @@
         <w:ind w:left="709"/>
       </w:pPr>
       <w:r>
-        <w:t>Die Bestimmung der örtlichen Zuständigkeit richtet sich gem. § 3 Abs. 1 S. 2 InsO in erster Linie nach dem Mittelpunkt der selbstständigen wirtschaftlichen Tätigkeit des Schuldners. Nur wenn keine selbstständige wirtschaftliche Tätigkeit mehr ausgeübt wird, ist gemäß § 3 Abs. 1 S. 1 InsO auf den allgemeinen Gerichtsstand des Schuldners abzustellen. Der Mittelpunkt der selbstständigen Tätigkeit liegt dort, wo unmittelbar Geschäfte abgeschlossen werden. Abzustellen ist auf den Ort der tatsächlichen Willensbil</w:t>
-      </w:r>
-      <w:r>
-        <w:t>dung, das heißt von wo aus die unternehmerischen Leitentscheidungen getroffen und in laufende Geschäftsführungsakte umgesetzt werden (OLG Brandenburg, ZInsO 2002, 767; AG Essen, ZInsO 2009, 2207).</w:t>
+        <w:t>Die Bestimmung der örtlichen Zuständigkeit richtet sich gem. § 3 Abs. 1 S. 2 InsO in erster Linie nach dem Mittelpunkt der selbstständigen wirtschaftlichen Tätigkeit des Schuldners. Nur wenn keine selbstständige wirtschaftliche Tätigkeit mehr ausgeübt wird, ist gemäß § 3 Abs. 1 S. 1 InsO auf den allgemeinen Gerichtsstand des Schuldners abzustellen. Der Mittelpunkt der selbstständigen Tätigkeit liegt dort, wo unmittelbar Geschäfte abgeschlossen werden. Abzustellen ist auf den Ort der tatsächlichen Willensbildung, das heißt von wo aus die unternehmerischen Leitentscheidungen getroffen und in laufende Geschäftsführungsakte umgesetzt werden (OLG Brandenburg, ZInsO 2002, 767; AG Essen, ZInsO 2009, 2207).</w:t>
       </w:r>
     </w:p>
     <w:p>
@@ -12549,16 +12195,16 @@
           <w:szCs w:val="22"/>
         </w:rPr>
       </w:pPr>
-      <w:bookmarkStart w:id="64" w:name="_Toc134620931"/>
-      <w:bookmarkStart w:id="65" w:name="_Toc202967552"/>
+      <w:bookmarkStart w:id="53" w:name="_Toc134620931"/>
+      <w:bookmarkStart w:id="54" w:name="_Toc202967552"/>
       <w:r>
         <w:rPr>
           <w:szCs w:val="22"/>
         </w:rPr>
         <w:t>Sicherungsmaßnahmen</w:t>
       </w:r>
-      <w:bookmarkEnd w:id="64"/>
-      <w:bookmarkEnd w:id="65"/>
+      <w:bookmarkEnd w:id="53"/>
+      <w:bookmarkEnd w:id="54"/>
     </w:p>
     <w:p>
       <w:pPr>
@@ -12595,16 +12241,16 @@
           <w:szCs w:val="22"/>
         </w:rPr>
       </w:pPr>
-      <w:bookmarkStart w:id="66" w:name="_Toc134620932"/>
-      <w:bookmarkStart w:id="67" w:name="_Toc202967553"/>
+      <w:bookmarkStart w:id="55" w:name="_Toc134620932"/>
+      <w:bookmarkStart w:id="56" w:name="_Toc202967553"/>
       <w:r>
         <w:rPr>
           <w:szCs w:val="22"/>
         </w:rPr>
         <w:t>Einzelermächtigungen</w:t>
       </w:r>
-      <w:bookmarkEnd w:id="66"/>
-      <w:bookmarkEnd w:id="67"/>
+      <w:bookmarkEnd w:id="55"/>
+      <w:bookmarkEnd w:id="56"/>
     </w:p>
     <w:p>
       <w:pPr>
@@ -12632,14 +12278,14 @@
           <w:szCs w:val="22"/>
         </w:rPr>
       </w:pPr>
-      <w:bookmarkStart w:id="68" w:name="_Toc202967554"/>
+      <w:bookmarkStart w:id="57" w:name="_Toc202967554"/>
       <w:r>
         <w:rPr>
           <w:szCs w:val="22"/>
         </w:rPr>
         <w:t>Informationen über das Unternehmen</w:t>
       </w:r>
-      <w:bookmarkEnd w:id="68"/>
+      <w:bookmarkEnd w:id="57"/>
     </w:p>
     <w:p/>
     <w:p/>
@@ -12654,18 +12300,18 @@
           <w:szCs w:val="22"/>
         </w:rPr>
       </w:pPr>
-      <w:bookmarkStart w:id="69" w:name="_Toc3475022"/>
-      <w:bookmarkStart w:id="70" w:name="_Toc134620934"/>
-      <w:bookmarkStart w:id="71" w:name="_Toc202967555"/>
+      <w:bookmarkStart w:id="58" w:name="_Toc3475022"/>
+      <w:bookmarkStart w:id="59" w:name="_Toc134620934"/>
+      <w:bookmarkStart w:id="60" w:name="_Toc202967555"/>
       <w:r>
         <w:rPr>
           <w:szCs w:val="22"/>
         </w:rPr>
         <w:t>Unternehmensgegenstand</w:t>
       </w:r>
-      <w:bookmarkEnd w:id="69"/>
-      <w:bookmarkEnd w:id="70"/>
-      <w:bookmarkEnd w:id="71"/>
+      <w:bookmarkEnd w:id="58"/>
+      <w:bookmarkEnd w:id="59"/>
+      <w:bookmarkEnd w:id="60"/>
     </w:p>
     <w:p/>
     <w:p>
@@ -12691,18 +12337,18 @@
           <w:szCs w:val="22"/>
         </w:rPr>
       </w:pPr>
-      <w:bookmarkStart w:id="72" w:name="_Toc3475023"/>
-      <w:bookmarkStart w:id="73" w:name="_Toc134620935"/>
-      <w:bookmarkStart w:id="74" w:name="_Toc202967556"/>
+      <w:bookmarkStart w:id="61" w:name="_Toc3475023"/>
+      <w:bookmarkStart w:id="62" w:name="_Toc134620935"/>
+      <w:bookmarkStart w:id="63" w:name="_Toc202967556"/>
       <w:r>
         <w:rPr>
           <w:szCs w:val="22"/>
         </w:rPr>
         <w:t>Gesellschaftsrechtliche Verhältnisse</w:t>
       </w:r>
-      <w:bookmarkEnd w:id="72"/>
-      <w:bookmarkEnd w:id="73"/>
-      <w:bookmarkEnd w:id="74"/>
+      <w:bookmarkEnd w:id="61"/>
+      <w:bookmarkEnd w:id="62"/>
+      <w:bookmarkEnd w:id="63"/>
     </w:p>
     <w:p/>
     <w:p>
@@ -12728,14 +12374,14 @@
           <w:highlight w:val="yellow"/>
         </w:rPr>
       </w:pPr>
-      <w:bookmarkStart w:id="75" w:name="_Toc202967557"/>
+      <w:bookmarkStart w:id="64" w:name="_Toc202967557"/>
       <w:r>
         <w:rPr>
           <w:highlight w:val="yellow"/>
         </w:rPr>
         <w:t>Finanzierungsstruktur</w:t>
       </w:r>
-      <w:bookmarkEnd w:id="75"/>
+      <w:bookmarkEnd w:id="64"/>
     </w:p>
     <w:p>
       <w:pPr>
@@ -12785,9 +12431,9 @@
           <w:szCs w:val="22"/>
         </w:rPr>
       </w:pPr>
-      <w:bookmarkStart w:id="76" w:name="_Toc3475024"/>
-      <w:bookmarkStart w:id="77" w:name="_Toc134620936"/>
-      <w:bookmarkStart w:id="78" w:name="_Toc202967558"/>
+      <w:bookmarkStart w:id="65" w:name="_Toc3475024"/>
+      <w:bookmarkStart w:id="66" w:name="_Toc134620936"/>
+      <w:bookmarkStart w:id="67" w:name="_Toc202967558"/>
       <w:r>
         <w:rPr>
           <w:szCs w:val="22"/>
@@ -12800,9 +12446,9 @@
         </w:rPr>
         <w:t>Vertragsverhältnisse</w:t>
       </w:r>
-      <w:bookmarkEnd w:id="76"/>
-      <w:bookmarkEnd w:id="77"/>
-      <w:bookmarkEnd w:id="78"/>
+      <w:bookmarkEnd w:id="65"/>
+      <w:bookmarkEnd w:id="66"/>
+      <w:bookmarkEnd w:id="67"/>
     </w:p>
     <w:p/>
     <w:p>
@@ -12816,16 +12462,16 @@
           <w:szCs w:val="22"/>
         </w:rPr>
       </w:pPr>
-      <w:bookmarkStart w:id="79" w:name="_Toc134620937"/>
-      <w:bookmarkStart w:id="80" w:name="_Toc202967559"/>
+      <w:bookmarkStart w:id="68" w:name="_Toc134620937"/>
+      <w:bookmarkStart w:id="69" w:name="_Toc202967559"/>
       <w:r>
         <w:rPr>
           <w:szCs w:val="22"/>
         </w:rPr>
         <w:t>Arbeitsrechtliche Verhältnisse</w:t>
       </w:r>
-      <w:bookmarkEnd w:id="79"/>
-      <w:bookmarkEnd w:id="80"/>
+      <w:bookmarkEnd w:id="68"/>
+      <w:bookmarkEnd w:id="69"/>
     </w:p>
     <w:p>
       <w:pPr>
@@ -12889,31 +12535,24 @@
           <w:highlight w:val="yellow"/>
         </w:rPr>
       </w:pPr>
-      <w:bookmarkStart w:id="81" w:name="_Toc134620938"/>
-      <w:bookmarkStart w:id="82" w:name="_Toc202967560"/>
+      <w:bookmarkStart w:id="70" w:name="_Toc134620938"/>
+      <w:bookmarkStart w:id="71" w:name="_Toc202967560"/>
       <w:r>
         <w:rPr>
           <w:szCs w:val="22"/>
           <w:highlight w:val="yellow"/>
         </w:rPr>
-        <w:t>Gewerberaumm</w:t>
-      </w:r>
+        <w:t>Gewerberaummietverträge</w:t>
+      </w:r>
+      <w:bookmarkEnd w:id="70"/>
       <w:r>
         <w:rPr>
           <w:szCs w:val="22"/>
           <w:highlight w:val="yellow"/>
         </w:rPr>
-        <w:t>ietverträge</w:t>
-      </w:r>
-      <w:bookmarkEnd w:id="81"/>
-      <w:r>
-        <w:rPr>
-          <w:szCs w:val="22"/>
-          <w:highlight w:val="yellow"/>
-        </w:rPr>
         <w:t xml:space="preserve"> / Pachtverträge</w:t>
       </w:r>
-      <w:bookmarkEnd w:id="82"/>
+      <w:bookmarkEnd w:id="71"/>
     </w:p>
     <w:p/>
     <w:p>
@@ -12939,18 +12578,18 @@
           <w:szCs w:val="22"/>
         </w:rPr>
       </w:pPr>
-      <w:bookmarkStart w:id="83" w:name="_Toc134620939"/>
-      <w:bookmarkStart w:id="84" w:name="_Toc202967561"/>
+      <w:bookmarkStart w:id="72" w:name="_Toc134620939"/>
+      <w:bookmarkStart w:id="73" w:name="_Toc202967561"/>
       <w:r>
         <w:rPr>
           <w:szCs w:val="22"/>
         </w:rPr>
         <w:t>Versicherungsverträge</w:t>
       </w:r>
-      <w:bookmarkStart w:id="85" w:name="_Toc3475027"/>
-      <w:bookmarkEnd w:id="83"/>
-      <w:bookmarkEnd w:id="84"/>
-      <w:bookmarkEnd w:id="85"/>
+      <w:bookmarkStart w:id="74" w:name="_Toc3475027"/>
+      <w:bookmarkEnd w:id="72"/>
+      <w:bookmarkEnd w:id="73"/>
+      <w:bookmarkEnd w:id="74"/>
     </w:p>
     <w:p/>
     <w:p>
@@ -12976,16 +12615,16 @@
           <w:szCs w:val="22"/>
         </w:rPr>
       </w:pPr>
-      <w:bookmarkStart w:id="86" w:name="_Toc134620940"/>
-      <w:bookmarkStart w:id="87" w:name="_Toc202967562"/>
+      <w:bookmarkStart w:id="75" w:name="_Toc134620940"/>
+      <w:bookmarkStart w:id="76" w:name="_Toc202967562"/>
       <w:r>
         <w:rPr>
           <w:szCs w:val="22"/>
         </w:rPr>
         <w:t>Versorgungsverträge</w:t>
       </w:r>
-      <w:bookmarkEnd w:id="86"/>
-      <w:bookmarkEnd w:id="87"/>
+      <w:bookmarkEnd w:id="75"/>
+      <w:bookmarkEnd w:id="76"/>
     </w:p>
     <w:p>
       <w:pPr>
@@ -13021,8 +12660,8 @@
           <w:highlight w:val="yellow"/>
         </w:rPr>
       </w:pPr>
-      <w:bookmarkStart w:id="88" w:name="_Toc134620941"/>
-      <w:bookmarkStart w:id="89" w:name="_Toc202967563"/>
+      <w:bookmarkStart w:id="77" w:name="_Toc134620941"/>
+      <w:bookmarkStart w:id="78" w:name="_Toc202967563"/>
       <w:r>
         <w:rPr>
           <w:szCs w:val="22"/>
@@ -13030,8 +12669,8 @@
         </w:rPr>
         <w:t>Leasingverträge</w:t>
       </w:r>
-      <w:bookmarkEnd w:id="88"/>
-      <w:bookmarkEnd w:id="89"/>
+      <w:bookmarkEnd w:id="77"/>
+      <w:bookmarkEnd w:id="78"/>
       <w:r>
         <w:rPr>
           <w:szCs w:val="22"/>
@@ -13069,14 +12708,14 @@
           <w:szCs w:val="22"/>
         </w:rPr>
       </w:pPr>
-      <w:bookmarkStart w:id="90" w:name="_Toc202967564"/>
+      <w:bookmarkStart w:id="79" w:name="_Toc202967564"/>
       <w:r>
         <w:rPr>
           <w:szCs w:val="22"/>
         </w:rPr>
         <w:t>Factoring</w:t>
       </w:r>
-      <w:bookmarkEnd w:id="90"/>
+      <w:bookmarkEnd w:id="79"/>
     </w:p>
     <w:p>
       <w:pPr>
@@ -13106,16 +12745,16 @@
           <w:szCs w:val="22"/>
         </w:rPr>
       </w:pPr>
-      <w:bookmarkStart w:id="91" w:name="_Toc134620943"/>
-      <w:bookmarkStart w:id="92" w:name="_Toc202967565"/>
+      <w:bookmarkStart w:id="80" w:name="_Toc134620943"/>
+      <w:bookmarkStart w:id="81" w:name="_Toc202967565"/>
       <w:r>
         <w:rPr>
           <w:szCs w:val="22"/>
         </w:rPr>
         <w:t>Sonstige Verträge</w:t>
       </w:r>
-      <w:bookmarkEnd w:id="91"/>
-      <w:bookmarkEnd w:id="92"/>
+      <w:bookmarkEnd w:id="80"/>
+      <w:bookmarkEnd w:id="81"/>
     </w:p>
     <w:p>
       <w:pPr>
@@ -13145,14 +12784,14 @@
           <w:szCs w:val="22"/>
         </w:rPr>
       </w:pPr>
-      <w:bookmarkStart w:id="93" w:name="_Toc202967566"/>
+      <w:bookmarkStart w:id="82" w:name="_Toc202967566"/>
       <w:r>
         <w:rPr>
           <w:szCs w:val="22"/>
         </w:rPr>
         <w:t>Arbeitsrechtliche Verhältnisse</w:t>
       </w:r>
-      <w:bookmarkEnd w:id="93"/>
+      <w:bookmarkEnd w:id="82"/>
     </w:p>
     <w:p>
       <w:pPr>
@@ -13656,14 +13295,14 @@
           <w:szCs w:val="22"/>
         </w:rPr>
       </w:pPr>
-      <w:bookmarkStart w:id="94" w:name="_Toc202967568"/>
+      <w:bookmarkStart w:id="83" w:name="_Toc202967568"/>
       <w:r>
         <w:rPr>
           <w:szCs w:val="22"/>
         </w:rPr>
         <w:t>Rechnungswesen</w:t>
       </w:r>
-      <w:bookmarkEnd w:id="94"/>
+      <w:bookmarkEnd w:id="83"/>
     </w:p>
     <w:p/>
     <w:p>
@@ -13677,14 +13316,14 @@
           <w:szCs w:val="22"/>
         </w:rPr>
       </w:pPr>
-      <w:bookmarkStart w:id="95" w:name="_Toc202967569"/>
+      <w:bookmarkStart w:id="84" w:name="_Toc202967569"/>
       <w:r>
         <w:rPr>
           <w:szCs w:val="22"/>
         </w:rPr>
         <w:t>Buchhaltung</w:t>
       </w:r>
-      <w:bookmarkEnd w:id="95"/>
+      <w:bookmarkEnd w:id="84"/>
       <w:r>
         <w:rPr>
           <w:szCs w:val="22"/>
@@ -13723,14 +13362,14 @@
           <w:szCs w:val="22"/>
         </w:rPr>
       </w:pPr>
-      <w:bookmarkStart w:id="96" w:name="_Toc202967570"/>
+      <w:bookmarkStart w:id="85" w:name="_Toc202967570"/>
       <w:r>
         <w:rPr>
           <w:szCs w:val="22"/>
         </w:rPr>
         <w:t>Buchhaltung</w:t>
       </w:r>
-      <w:bookmarkEnd w:id="96"/>
+      <w:bookmarkEnd w:id="85"/>
       <w:r>
         <w:rPr>
           <w:szCs w:val="22"/>
@@ -13793,14 +13432,14 @@
           <w:szCs w:val="22"/>
         </w:rPr>
       </w:pPr>
-      <w:bookmarkStart w:id="97" w:name="_Toc202967572"/>
+      <w:bookmarkStart w:id="86" w:name="_Toc202967572"/>
       <w:r>
         <w:rPr>
           <w:szCs w:val="22"/>
         </w:rPr>
         <w:t>Betriebswirtschaftliche Verhältnisse</w:t>
       </w:r>
-      <w:bookmarkEnd w:id="97"/>
+      <w:bookmarkEnd w:id="86"/>
     </w:p>
     <w:p>
       <w:pPr>
@@ -13823,13 +13462,7 @@
         <w:rPr>
           <w:szCs w:val="22"/>
         </w:rPr>
-        <w:t xml:space="preserve">Wirtschaftliche Entwicklung und </w:t>
-      </w:r>
-      <w:r>
-        <w:rPr>
-          <w:szCs w:val="22"/>
-        </w:rPr>
-        <w:t>Krisenursache</w:t>
+        <w:t>Wirtschaftliche Entwicklung und Krisenursache</w:t>
       </w:r>
     </w:p>
     <w:p>
@@ -14298,8 +13931,6 @@
       </w:r>
       <w:r>
         <w:tab/>
-      </w:r>
-      <w:r>
         <w:t>Goodwill / Firmenwert</w:t>
       </w:r>
     </w:p>
@@ -14326,12 +13957,7 @@
       </w:r>
       <w:r>
         <w:tab/>
-      </w:r>
-      <w:r>
-        <w:t>selbst geschaffene gewerbliche Schutzrechte</w:t>
-      </w:r>
-      <w:r>
-        <w:t xml:space="preserve"> und ähnliche Rechte</w:t>
+        <w:t>selbst geschaffene gewerbliche Schutzrechte und ähnliche Rechte</w:t>
       </w:r>
     </w:p>
     <w:p>
@@ -14360,18 +13986,7 @@
       </w:r>
       <w:r>
         <w:tab/>
-      </w:r>
-      <w:r>
-        <w:t>entgeltlich erworbene Konzessionen</w:t>
-      </w:r>
-      <w:r>
-        <w:t>,</w:t>
-      </w:r>
-      <w:r>
-        <w:t xml:space="preserve"> gewerbliche Schutzrechte</w:t>
-      </w:r>
-      <w:r>
-        <w:t xml:space="preserve"> und ähnliche Rechte</w:t>
+        <w:t>entgeltlich erworbene Konzessionen, gewerbliche Schutzrechte und ähnliche Rechte</w:t>
       </w:r>
     </w:p>
     <w:p>
@@ -14421,8 +14036,6 @@
       </w:r>
       <w:r>
         <w:tab/>
-      </w:r>
-      <w:r>
         <w:t>Grundstücke und grundstücksgleiche Rechte</w:t>
       </w:r>
     </w:p>
@@ -14452,8 +14065,6 @@
       </w:r>
       <w:r>
         <w:tab/>
-      </w:r>
-      <w:r>
         <w:t>technische Anlagen und Maschinen</w:t>
       </w:r>
     </w:p>
@@ -14481,8 +14092,6 @@
       </w:r>
       <w:r>
         <w:tab/>
-      </w:r>
-      <w:r>
         <w:t>Betriebs- und Geschäftsausstattung</w:t>
       </w:r>
     </w:p>
@@ -14537,8 +14146,6 @@
       </w:r>
       <w:r>
         <w:tab/>
-      </w:r>
-      <w:r>
         <w:t>Anteile an verbundenen Unternehmen</w:t>
       </w:r>
     </w:p>
@@ -14581,8 +14188,6 @@
       </w:r>
       <w:r>
         <w:tab/>
-      </w:r>
-      <w:r>
         <w:t>Beteiligungen</w:t>
       </w:r>
     </w:p>
@@ -14619,15 +14224,7 @@
       </w:r>
       <w:r>
         <w:tab/>
-      </w:r>
-      <w:r>
-        <w:t>Wertpapier</w:t>
-      </w:r>
-      <w:r>
-        <w:t>e</w:t>
-      </w:r>
-      <w:r>
-        <w:t xml:space="preserve"> des Anlagevermögens</w:t>
+        <w:t>Wertpapiere des Anlagevermögens</w:t>
       </w:r>
     </w:p>
     <w:p>
@@ -14697,8 +14294,6 @@
       </w:r>
       <w:r>
         <w:tab/>
-      </w:r>
-      <w:r>
         <w:t>Roh-, Hilfs- und Betriebsstoffe</w:t>
       </w:r>
     </w:p>
@@ -14735,8 +14330,6 @@
       </w:r>
       <w:r>
         <w:tab/>
-      </w:r>
-      <w:r>
         <w:t>unfertige Erzeugnisse</w:t>
       </w:r>
       <w:r>
@@ -14864,8 +14457,6 @@
       </w:r>
       <w:r>
         <w:tab/>
-      </w:r>
-      <w:r>
         <w:t>Forderungen gegen Unternehmen, mit denen ein Beteiligungsverhältnis besteht</w:t>
       </w:r>
     </w:p>
@@ -14896,8 +14487,6 @@
       </w:r>
       <w:r>
         <w:tab/>
-      </w:r>
-      <w:r>
         <w:t>sonstige Vermögensgegenstände</w:t>
       </w:r>
     </w:p>
@@ -15994,10 +15583,7 @@
         <w:ind w:left="709"/>
       </w:pPr>
       <w:r>
-        <w:t>Nach der Leitentscheidung des BGH vom 24.05.2005 (Az. IX ZR 123/04) liegt Zahlungsunfähigkeit im Sinne des § 17 InsO regelmäßig jedenfalls dann vor, wenn der Schuldner 10 % oder mehr seiner fälligen Gesamtverbindlichkeiten länger als drei Wochen nicht erfüllen kann, sofern nicht ausnahmsweise mit an Sicherheit grenzender Wahrscheinlichkeit zu erwarten ist, dass die Liquiditätslücke demnächst vollständig oder fast vollständig beseitigt werden wird und den Gläubigern ein Zuwarten nach den besonderen Umständen</w:t>
-      </w:r>
-      <w:r>
-        <w:t xml:space="preserve"> des Einzelfalls zuzumuten ist. Nach einer weiteren Grundsatzentscheidung des BGH (Beschl. v. 19.07.2007 – IX ZB 36/07) sind nur die „ernsthaft eingeforderten" fälligen Forderungen bei Feststellung der Zahlungsunfähigkeit zu berücksichtigen.</w:t>
+        <w:t>Nach der Leitentscheidung des BGH vom 24.05.2005 (Az. IX ZR 123/04) liegt Zahlungsunfähigkeit im Sinne des § 17 InsO regelmäßig jedenfalls dann vor, wenn der Schuldner 10 % oder mehr seiner fälligen Gesamtverbindlichkeiten länger als drei Wochen nicht erfüllen kann, sofern nicht ausnahmsweise mit an Sicherheit grenzender Wahrscheinlichkeit zu erwarten ist, dass die Liquiditätslücke demnächst vollständig oder fast vollständig beseitigt werden wird und den Gläubigern ein Zuwarten nach den besonderen Umständen des Einzelfalls zuzumuten ist. Nach einer weiteren Grundsatzentscheidung des BGH (Beschl. v. 19.07.2007 – IX ZB 36/07) sind nur die „ernsthaft eingeforderten" fälligen Forderungen bei Feststellung der Zahlungsunfähigkeit zu berücksichtigen.</w:t>
       </w:r>
     </w:p>
     <w:p/>
@@ -16226,13 +15812,7 @@
         <w:rPr>
           <w:szCs w:val="22"/>
         </w:rPr>
-        <w:t>An</w:t>
-      </w:r>
-      <w:r>
-        <w:rPr>
-          <w:szCs w:val="22"/>
-        </w:rPr>
-        <w:t>sprüche aus Insolvenzanfechtung</w:t>
+        <w:t>Ansprüche aus Insolvenzanfechtung</w:t>
       </w:r>
     </w:p>
     <w:p>
@@ -16721,25 +16301,7 @@
         <w:rPr>
           <w:u w:val="single"/>
         </w:rPr>
-        <w:t>An</w:t>
-      </w:r>
-      <w:r>
-        <w:rPr>
-          <w:u w:val="single"/>
-        </w:rPr>
-        <w:t>l</w:t>
-      </w:r>
-      <w:r>
-        <w:rPr>
-          <w:u w:val="single"/>
-        </w:rPr>
-        <w:t>a</w:t>
-      </w:r>
-      <w:r>
-        <w:rPr>
-          <w:u w:val="single"/>
-        </w:rPr>
-        <w:t>gen:</w:t>
+        <w:t>Anlagen:</w:t>
       </w:r>
     </w:p>
     <w:tbl>
@@ -23740,7 +23302,7 @@
   <w:style w:type="paragraph" w:default="1" w:styleId="Normal">
     <w:name w:val="Normal"/>
     <w:qFormat/>
-    <w:rsid w:val="00281854"/>
+    <w:rsid w:val="00F86711"/>
     <w:pPr>
       <w:spacing w:line="360" w:lineRule="auto"/>
       <w:jc w:val="both"/>

</xml_diff>

<commit_message>
feat: add KI_* Briefkopf placeholders to all 3 Gutachten templates Co-Authored-By: Claude Opus 4.6 (1M context) <noreply@anthropic.com>
</commit_message>
<xml_diff>
--- a/gutachtenvorlagen/Gutachten Muster juristische Person.docx
+++ b/gutachtenvorlagen/Gutachten Muster juristische Person.docx
@@ -3221,7 +3221,7 @@
           <w:noProof/>
         </w:rPr>
         <w:drawing>
-          <wp:anchor distT="0" distB="0" distL="114300" distR="114300" simplePos="0" relativeHeight="251661312" behindDoc="0" locked="1" layoutInCell="1" allowOverlap="1" wp14:anchorId="6AABFA21" wp14:editId="28F68B56">
+          <wp:anchor distT="0" distB="0" distL="114300" distR="114300" simplePos="0" relativeHeight="251661312" behindDoc="0" locked="1" layoutInCell="1" allowOverlap="1" wp14:anchorId="6AABFA21" wp14:editId="11CA4737">
             <wp:simplePos x="0" y="0"/>
             <wp:positionH relativeFrom="column">
               <wp:posOffset>5670550</wp:posOffset>
@@ -3459,7 +3459,17 @@
         <w:jc w:val="center"/>
       </w:pPr>
       <w:r>
-        <w:t>- nachfolgend „Antragsgegnerin“ -</w:t>
+        <w:t>- nachfolgend „</w:t>
+      </w:r>
+      <w:r>
+        <w:rPr>
+          <w:b/>
+          <w:bCs/>
+        </w:rPr>
+        <w:t>Antragsgegnerin</w:t>
+      </w:r>
+      <w:r>
+        <w:t>“ -</w:t>
       </w:r>
     </w:p>
     <w:p/>
@@ -3468,7 +3478,13 @@
       <w:pPr>
         <w:jc w:val="center"/>
       </w:pPr>
-      <w:r>
+    </w:p>
+    <w:p>
+      <w:pPr>
+        <w:jc w:val="center"/>
+      </w:pPr>
+      <w:r>
+        <w:lastRenderedPageBreak/>
         <w:t xml:space="preserve">Amtsgericht </w:t>
       </w:r>
       <w:bookmarkStart w:id="10" w:name="KI_Gericht_Ort"/>
@@ -3476,16 +3492,12 @@
         <w:t>KI_Gericht_Ort</w:t>
       </w:r>
       <w:bookmarkEnd w:id="10"/>
-      <w:r>
-        <w:t xml:space="preserve"> </w:t>
-      </w:r>
     </w:p>
     <w:p>
       <w:pPr>
         <w:jc w:val="center"/>
       </w:pPr>
       <w:r>
-        <w:lastRenderedPageBreak/>
         <w:t>-KI_Akte_GerichtAZ-</w:t>
       </w:r>
     </w:p>
@@ -3667,7 +3679,7 @@
           <w:noProof/>
           <w:lang w:eastAsia="de-DE"/>
         </w:rPr>
-        <w:pict w14:anchorId="3E3D1585">
+        <w:pict w14:anchorId="5ED69665">
           <v:shapetype id="_x0000_t75" coordsize="21600,21600" o:spt="75" o:preferrelative="t" path="m@4@5l@4@11@9@11@9@5xe" filled="f" stroked="f">
             <v:stroke joinstyle="miter"/>
             <v:formulas>
@@ -3687,7 +3699,7 @@
             <v:path o:extrusionok="f" gradientshapeok="t" o:connecttype="rect"/>
             <o:lock v:ext="edit" aspectratio="t"/>
           </v:shapetype>
-          <v:shape id="_x0000_i1025" type="#_x0000_t75" alt="" style="width:115.85pt;height:81.95pt;mso-width-percent:0;mso-height-percent:0;mso-width-percent:0;mso-height-percent:0">
+          <v:shape id="_x0000_i1025" type="#_x0000_t75" alt="" style="width:115.8pt;height:81.75pt;mso-width-percent:0;mso-height-percent:0;mso-width-percent:0;mso-height-percent:0">
             <v:imagedata r:id="rId10" o:title="Logo_Schmidt_180x180px" croptop="8033f" cropbottom="11416f"/>
           </v:shape>
         </w:pict>

</xml_diff>